<commit_message>
feat: Add Matlab test
</commit_message>
<xml_diff>
--- a/08-semester/Автоматика/Лабы. Решения/Лабораторная 3.docx
+++ b/08-semester/Автоматика/Лабы. Решения/Лабораторная 3.docx
@@ -324,31 +324,7 @@
               <w:rFonts w:ascii="Cambria Math" w:eastAsiaTheme="minorEastAsia" w:hAnsi="Cambria Math"/>
               <w:lang w:eastAsia="ru-RU"/>
             </w:rPr>
-            <m:t>(</m:t>
-          </m:r>
-          <m:r>
-            <w:rPr>
-              <w:rStyle w:val="a4"/>
-              <w:rFonts w:ascii="Cambria Math" w:eastAsiaTheme="minorEastAsia" w:hAnsi="Cambria Math"/>
-              <w:lang w:eastAsia="ru-RU"/>
-            </w:rPr>
-            <m:t>s</m:t>
-          </m:r>
-          <m:r>
-            <w:rPr>
-              <w:rStyle w:val="a4"/>
-              <w:rFonts w:ascii="Cambria Math" w:eastAsiaTheme="minorEastAsia" w:hAnsi="Cambria Math"/>
-              <w:lang w:eastAsia="ru-RU"/>
-            </w:rPr>
-            <m:t>)</m:t>
-          </m:r>
-          <m:r>
-            <w:rPr>
-              <w:rStyle w:val="a4"/>
-              <w:rFonts w:ascii="Cambria Math" w:eastAsiaTheme="minorEastAsia" w:hAnsi="Cambria Math"/>
-              <w:lang w:eastAsia="ru-RU"/>
-            </w:rPr>
-            <m:t xml:space="preserve">= </m:t>
+            <m:t xml:space="preserve">(s)= </m:t>
           </m:r>
           <m:f>
             <m:fPr>
@@ -372,13 +348,7 @@
                 <w:rPr>
                   <w:rFonts w:ascii="Cambria Math" w:eastAsiaTheme="minorEastAsia" w:hAnsi="Cambria Math"/>
                 </w:rPr>
-                <m:t>0,</m:t>
-              </m:r>
-              <m:r>
-                <w:rPr>
-                  <w:rFonts w:ascii="Cambria Math" w:eastAsiaTheme="minorEastAsia" w:hAnsi="Cambria Math"/>
-                </w:rPr>
-                <m:t>05</m:t>
+                <m:t>0,05</m:t>
               </m:r>
               <m:sSup>
                 <m:sSupPr>
@@ -410,13 +380,7 @@
                 <w:rPr>
                   <w:rFonts w:ascii="Cambria Math" w:eastAsiaTheme="minorEastAsia" w:hAnsi="Cambria Math"/>
                 </w:rPr>
-                <m:t>+0,</m:t>
-              </m:r>
-              <m:r>
-                <w:rPr>
-                  <w:rFonts w:ascii="Cambria Math" w:eastAsiaTheme="minorEastAsia" w:hAnsi="Cambria Math"/>
-                </w:rPr>
-                <m:t>1</m:t>
+                <m:t>+0,1</m:t>
               </m:r>
               <m:sSup>
                 <m:sSupPr>
@@ -480,25 +444,7 @@
                 <w:rPr>
                   <w:rFonts w:ascii="Cambria Math" w:eastAsiaTheme="minorEastAsia" w:hAnsi="Cambria Math"/>
                 </w:rPr>
-                <m:t>+</m:t>
-              </m:r>
-              <m:r>
-                <w:rPr>
-                  <w:rFonts w:ascii="Cambria Math" w:eastAsiaTheme="minorEastAsia" w:hAnsi="Cambria Math"/>
-                </w:rPr>
-                <m:t>s</m:t>
-              </m:r>
-              <m:r>
-                <w:rPr>
-                  <w:rFonts w:ascii="Cambria Math" w:eastAsiaTheme="minorEastAsia" w:hAnsi="Cambria Math"/>
-                </w:rPr>
-                <m:t>+</m:t>
-              </m:r>
-              <m:r>
-                <w:rPr>
-                  <w:rFonts w:ascii="Cambria Math" w:eastAsiaTheme="minorEastAsia" w:hAnsi="Cambria Math"/>
-                </w:rPr>
-                <m:t>1</m:t>
+                <m:t>+s+1</m:t>
               </m:r>
             </m:den>
           </m:f>
@@ -525,10 +471,7 @@
         <w:t xml:space="preserve"> </w:t>
       </w:r>
       <w:r>
-        <w:t>– реакция системы на единичное ступенчатое воздействие</w:t>
-      </w:r>
-      <w:r>
-        <w:t>:</w:t>
+        <w:t>– реакция системы на единичное ступенчатое воздействие:</w:t>
       </w:r>
     </w:p>
     <w:p>
@@ -545,21 +488,7 @@
               <w:rFonts w:ascii="Cambria Math" w:hAnsi="Cambria Math"/>
               <w:lang w:val="en-US"/>
             </w:rPr>
-            <m:t>H(</m:t>
-          </m:r>
-          <m:r>
-            <w:rPr>
-              <w:rFonts w:ascii="Cambria Math" w:hAnsi="Cambria Math"/>
-              <w:lang w:val="en-US"/>
-            </w:rPr>
-            <m:t>s</m:t>
-          </m:r>
-          <m:r>
-            <w:rPr>
-              <w:rFonts w:ascii="Cambria Math" w:hAnsi="Cambria Math"/>
-              <w:lang w:val="en-US"/>
-            </w:rPr>
-            <m:t>)=</m:t>
+            <m:t>H(s)=</m:t>
           </m:r>
           <m:f>
             <m:fPr>
@@ -610,23 +539,7 @@
                   <w:rFonts w:ascii="Cambria Math" w:eastAsiaTheme="minorEastAsia" w:hAnsi="Cambria Math"/>
                   <w:lang w:eastAsia="ru-RU"/>
                 </w:rPr>
-                <m:t>(</m:t>
-              </m:r>
-              <m:r>
-                <w:rPr>
-                  <w:rStyle w:val="a4"/>
-                  <w:rFonts w:ascii="Cambria Math" w:eastAsiaTheme="minorEastAsia" w:hAnsi="Cambria Math"/>
-                  <w:lang w:eastAsia="ru-RU"/>
-                </w:rPr>
-                <m:t>s</m:t>
-              </m:r>
-              <m:r>
-                <w:rPr>
-                  <w:rStyle w:val="a4"/>
-                  <w:rFonts w:ascii="Cambria Math" w:eastAsiaTheme="minorEastAsia" w:hAnsi="Cambria Math"/>
-                  <w:lang w:eastAsia="ru-RU"/>
-                </w:rPr>
-                <m:t>)</m:t>
+                <m:t>(s)</m:t>
               </m:r>
             </m:num>
             <m:den>
@@ -670,19 +583,7 @@
                 <w:rPr>
                   <w:rFonts w:ascii="Cambria Math" w:eastAsiaTheme="minorEastAsia" w:hAnsi="Cambria Math"/>
                 </w:rPr>
-                <m:t>s</m:t>
-              </m:r>
-              <m:r>
-                <w:rPr>
-                  <w:rFonts w:ascii="Cambria Math" w:eastAsiaTheme="minorEastAsia" w:hAnsi="Cambria Math"/>
-                </w:rPr>
-                <m:t>(</m:t>
-              </m:r>
-              <m:r>
-                <w:rPr>
-                  <w:rFonts w:ascii="Cambria Math" w:eastAsiaTheme="minorEastAsia" w:hAnsi="Cambria Math"/>
-                </w:rPr>
-                <m:t>0,05</m:t>
+                <m:t>s(0,05</m:t>
               </m:r>
               <m:sSup>
                 <m:sSupPr>
@@ -778,31 +679,7 @@
                 <w:rPr>
                   <w:rFonts w:ascii="Cambria Math" w:eastAsiaTheme="minorEastAsia" w:hAnsi="Cambria Math"/>
                 </w:rPr>
-                <m:t>+</m:t>
-              </m:r>
-              <m:r>
-                <w:rPr>
-                  <w:rFonts w:ascii="Cambria Math" w:eastAsiaTheme="minorEastAsia" w:hAnsi="Cambria Math"/>
-                </w:rPr>
-                <m:t>s</m:t>
-              </m:r>
-              <m:r>
-                <w:rPr>
-                  <w:rFonts w:ascii="Cambria Math" w:eastAsiaTheme="minorEastAsia" w:hAnsi="Cambria Math"/>
-                </w:rPr>
-                <m:t>+</m:t>
-              </m:r>
-              <m:r>
-                <w:rPr>
-                  <w:rFonts w:ascii="Cambria Math" w:eastAsiaTheme="minorEastAsia" w:hAnsi="Cambria Math"/>
-                </w:rPr>
-                <m:t>1</m:t>
-              </m:r>
-              <m:r>
-                <w:rPr>
-                  <w:rFonts w:ascii="Cambria Math" w:eastAsiaTheme="minorEastAsia" w:hAnsi="Cambria Math"/>
-                </w:rPr>
-                <m:t>)</m:t>
+                <m:t>+s+1)</m:t>
               </m:r>
             </m:den>
           </m:f>
@@ -1048,13 +925,7 @@
                 <w:rPr>
                   <w:rFonts w:ascii="Cambria Math" w:eastAsiaTheme="minorEastAsia" w:hAnsi="Cambria Math"/>
                 </w:rPr>
-                <m:t>0,</m:t>
-              </m:r>
-              <m:r>
-                <w:rPr>
-                  <w:rFonts w:ascii="Cambria Math" w:eastAsiaTheme="minorEastAsia" w:hAnsi="Cambria Math"/>
-                </w:rPr>
-                <m:t>05</m:t>
+                <m:t>0,05</m:t>
               </m:r>
               <m:sSup>
                 <m:sSupPr>
@@ -1086,13 +957,7 @@
                 <w:rPr>
                   <w:rFonts w:ascii="Cambria Math" w:eastAsiaTheme="minorEastAsia" w:hAnsi="Cambria Math"/>
                 </w:rPr>
-                <m:t>+0,</m:t>
-              </m:r>
-              <m:r>
-                <w:rPr>
-                  <w:rFonts w:ascii="Cambria Math" w:eastAsiaTheme="minorEastAsia" w:hAnsi="Cambria Math"/>
-                </w:rPr>
-                <m:t>1</m:t>
+                <m:t>+0,1</m:t>
               </m:r>
               <m:sSup>
                 <m:sSupPr>
@@ -1156,31 +1021,7 @@
                 <w:rPr>
                   <w:rFonts w:ascii="Cambria Math" w:eastAsiaTheme="minorEastAsia" w:hAnsi="Cambria Math"/>
                 </w:rPr>
-                <m:t>+</m:t>
-              </m:r>
-              <m:r>
-                <w:rPr>
-                  <w:rFonts w:ascii="Cambria Math" w:eastAsiaTheme="minorEastAsia" w:hAnsi="Cambria Math"/>
-                </w:rPr>
-                <m:t>s</m:t>
-              </m:r>
-              <m:r>
-                <w:rPr>
-                  <w:rFonts w:ascii="Cambria Math" w:eastAsiaTheme="minorEastAsia" w:hAnsi="Cambria Math"/>
-                </w:rPr>
-                <m:t>+</m:t>
-              </m:r>
-              <m:r>
-                <w:rPr>
-                  <w:rFonts w:ascii="Cambria Math" w:eastAsiaTheme="minorEastAsia" w:hAnsi="Cambria Math"/>
-                </w:rPr>
-                <m:t>1</m:t>
-              </m:r>
-              <m:r>
-                <w:rPr>
-                  <w:rFonts w:ascii="Cambria Math" w:eastAsiaTheme="minorEastAsia" w:hAnsi="Cambria Math"/>
-                </w:rPr>
-                <m:t>+1</m:t>
+                <m:t>+s+1+1</m:t>
               </m:r>
             </m:den>
           </m:f>
@@ -1190,15 +1031,7 @@
               <w:rFonts w:ascii="Cambria Math" w:eastAsiaTheme="minorEastAsia" w:hAnsi="Cambria Math"/>
               <w:lang w:eastAsia="ru-RU"/>
             </w:rPr>
-            <m:t>=</m:t>
-          </m:r>
-          <m:r>
-            <w:rPr>
-              <w:rStyle w:val="a4"/>
-              <w:rFonts w:ascii="Cambria Math" w:eastAsiaTheme="minorEastAsia" w:hAnsi="Cambria Math"/>
-              <w:lang w:eastAsia="ru-RU"/>
-            </w:rPr>
-            <m:t>=</m:t>
+            <m:t>==</m:t>
           </m:r>
           <m:f>
             <m:fPr>
@@ -1226,13 +1059,7 @@
                 <w:rPr>
                   <w:rFonts w:ascii="Cambria Math" w:eastAsiaTheme="minorEastAsia" w:hAnsi="Cambria Math"/>
                 </w:rPr>
-                <m:t>0,</m:t>
-              </m:r>
-              <m:r>
-                <w:rPr>
-                  <w:rFonts w:ascii="Cambria Math" w:eastAsiaTheme="minorEastAsia" w:hAnsi="Cambria Math"/>
-                </w:rPr>
-                <m:t>05</m:t>
+                <m:t>0,05</m:t>
               </m:r>
               <m:sSup>
                 <m:sSupPr>
@@ -1264,13 +1091,7 @@
                 <w:rPr>
                   <w:rFonts w:ascii="Cambria Math" w:eastAsiaTheme="minorEastAsia" w:hAnsi="Cambria Math"/>
                 </w:rPr>
-                <m:t>+0,</m:t>
-              </m:r>
-              <m:r>
-                <w:rPr>
-                  <w:rFonts w:ascii="Cambria Math" w:eastAsiaTheme="minorEastAsia" w:hAnsi="Cambria Math"/>
-                </w:rPr>
-                <m:t>1</m:t>
+                <m:t>+0,1</m:t>
               </m:r>
               <m:sSup>
                 <m:sSupPr>
@@ -1334,25 +1155,7 @@
                 <w:rPr>
                   <w:rFonts w:ascii="Cambria Math" w:eastAsiaTheme="minorEastAsia" w:hAnsi="Cambria Math"/>
                 </w:rPr>
-                <m:t>+</m:t>
-              </m:r>
-              <m:r>
-                <w:rPr>
-                  <w:rFonts w:ascii="Cambria Math" w:eastAsiaTheme="minorEastAsia" w:hAnsi="Cambria Math"/>
-                </w:rPr>
-                <m:t>s</m:t>
-              </m:r>
-              <m:r>
-                <w:rPr>
-                  <w:rFonts w:ascii="Cambria Math" w:eastAsiaTheme="minorEastAsia" w:hAnsi="Cambria Math"/>
-                </w:rPr>
-                <m:t>+</m:t>
-              </m:r>
-              <m:r>
-                <w:rPr>
-                  <w:rFonts w:ascii="Cambria Math" w:eastAsiaTheme="minorEastAsia" w:hAnsi="Cambria Math"/>
-                </w:rPr>
-                <m:t>2</m:t>
+                <m:t>+s+2</m:t>
               </m:r>
             </m:den>
           </m:f>
@@ -1413,13 +1216,7 @@
             <w:rPr>
               <w:rFonts w:ascii="Cambria Math" w:eastAsiaTheme="minorEastAsia" w:hAnsi="Cambria Math"/>
             </w:rPr>
-            <m:t>0,</m:t>
-          </m:r>
-          <m:r>
-            <w:rPr>
-              <w:rFonts w:ascii="Cambria Math" w:eastAsiaTheme="minorEastAsia" w:hAnsi="Cambria Math"/>
-            </w:rPr>
-            <m:t>05</m:t>
+            <m:t>0,05</m:t>
           </m:r>
           <m:sSup>
             <m:sSupPr>
@@ -1451,13 +1248,7 @@
             <w:rPr>
               <w:rFonts w:ascii="Cambria Math" w:eastAsiaTheme="minorEastAsia" w:hAnsi="Cambria Math"/>
             </w:rPr>
-            <m:t>+0,</m:t>
-          </m:r>
-          <m:r>
-            <w:rPr>
-              <w:rFonts w:ascii="Cambria Math" w:eastAsiaTheme="minorEastAsia" w:hAnsi="Cambria Math"/>
-            </w:rPr>
-            <m:t>1</m:t>
+            <m:t>+0,1</m:t>
           </m:r>
           <m:sSup>
             <m:sSupPr>
@@ -1521,25 +1312,7 @@
             <w:rPr>
               <w:rFonts w:ascii="Cambria Math" w:eastAsiaTheme="minorEastAsia" w:hAnsi="Cambria Math"/>
             </w:rPr>
-            <m:t>+</m:t>
-          </m:r>
-          <m:r>
-            <w:rPr>
-              <w:rFonts w:ascii="Cambria Math" w:eastAsiaTheme="minorEastAsia" w:hAnsi="Cambria Math"/>
-            </w:rPr>
-            <m:t>s</m:t>
-          </m:r>
-          <m:r>
-            <w:rPr>
-              <w:rFonts w:ascii="Cambria Math" w:eastAsiaTheme="minorEastAsia" w:hAnsi="Cambria Math"/>
-            </w:rPr>
-            <m:t>+</m:t>
-          </m:r>
-          <m:r>
-            <w:rPr>
-              <w:rFonts w:ascii="Cambria Math" w:eastAsiaTheme="minorEastAsia" w:hAnsi="Cambria Math"/>
-            </w:rPr>
-            <m:t>2</m:t>
+            <m:t>+s+2</m:t>
           </m:r>
         </m:oMath>
       </m:oMathPara>
@@ -2559,13 +2332,7 @@
             <w:rPr>
               <w:rFonts w:ascii="Cambria Math" w:hAnsi="Cambria Math"/>
             </w:rPr>
-            <m:t>=</m:t>
-          </m:r>
-          <m:r>
-            <w:rPr>
-              <w:rFonts w:ascii="Cambria Math" w:hAnsi="Cambria Math"/>
-            </w:rPr>
-            <m:t>det</m:t>
+            <m:t>=det</m:t>
           </m:r>
           <m:d>
             <m:dPr>
@@ -2637,13 +2404,7 @@
             <w:rPr>
               <w:rFonts w:ascii="Cambria Math" w:hAnsi="Cambria Math"/>
             </w:rPr>
-            <m:t>=0.1</m:t>
-          </m:r>
-          <m:r>
-            <w:rPr>
-              <w:rFonts w:ascii="Cambria Math" w:hAnsi="Cambria Math"/>
-            </w:rPr>
-            <m:t>∙1</m:t>
+            <m:t>=0.1∙1</m:t>
           </m:r>
           <m:r>
             <m:rPr>
@@ -2659,13 +2420,7 @@
             <w:rPr>
               <w:rFonts w:ascii="Cambria Math" w:hAnsi="Cambria Math"/>
             </w:rPr>
-            <m:t>0.05∙1=</m:t>
-          </m:r>
-          <m:r>
-            <w:rPr>
-              <w:rFonts w:ascii="Cambria Math" w:hAnsi="Cambria Math"/>
-            </w:rPr>
-            <m:t>0.05&gt;0</m:t>
+            <m:t>0.05∙1=0.05&gt;0</m:t>
           </m:r>
         </m:oMath>
       </m:oMathPara>
@@ -2896,25 +2651,7 @@
             <w:rPr>
               <w:rFonts w:ascii="Cambria Math" w:hAnsi="Cambria Math"/>
             </w:rPr>
-            <m:t>=0.1∙</m:t>
-          </m:r>
-          <m:r>
-            <w:rPr>
-              <w:rFonts w:ascii="Cambria Math" w:hAnsi="Cambria Math"/>
-            </w:rPr>
-            <m:t>(1</m:t>
-          </m:r>
-          <m:r>
-            <w:rPr>
-              <w:rFonts w:ascii="Cambria Math" w:hAnsi="Cambria Math"/>
-            </w:rPr>
-            <m:t>∙</m:t>
-          </m:r>
-          <m:r>
-            <w:rPr>
-              <w:rFonts w:ascii="Cambria Math" w:hAnsi="Cambria Math"/>
-            </w:rPr>
-            <m:t>1</m:t>
+            <m:t>=0.1∙(1∙1</m:t>
           </m:r>
           <m:r>
             <m:rPr>
@@ -2924,7 +2661,13 @@
               <w:rStyle w:val="a4"/>
               <w:rFonts w:ascii="Cambria Math" w:hAnsi="Cambria Math"/>
             </w:rPr>
-            <m:t>-</m:t>
+            <m:t>-2</m:t>
+          </m:r>
+          <m:r>
+            <w:rPr>
+              <w:rFonts w:ascii="Cambria Math" w:hAnsi="Cambria Math"/>
+            </w:rPr>
+            <m:t>∙0.1)</m:t>
           </m:r>
           <m:r>
             <m:rPr>
@@ -2934,19 +2677,13 @@
               <w:rStyle w:val="a4"/>
               <w:rFonts w:ascii="Cambria Math" w:hAnsi="Cambria Math"/>
             </w:rPr>
-            <m:t>2</m:t>
+            <m:t>-1</m:t>
           </m:r>
           <m:r>
             <w:rPr>
               <w:rFonts w:ascii="Cambria Math" w:hAnsi="Cambria Math"/>
             </w:rPr>
-            <m:t>∙</m:t>
-          </m:r>
-          <m:r>
-            <w:rPr>
-              <w:rFonts w:ascii="Cambria Math" w:hAnsi="Cambria Math"/>
-            </w:rPr>
-            <m:t>0.1)</m:t>
+            <m:t>∙(0.05∙1</m:t>
           </m:r>
           <m:r>
             <m:rPr>
@@ -2956,85 +2693,398 @@
               <w:rStyle w:val="a4"/>
               <w:rFonts w:ascii="Cambria Math" w:hAnsi="Cambria Math"/>
             </w:rPr>
-            <m:t>-</m:t>
-          </m:r>
-          <m:r>
-            <m:rPr>
-              <m:sty m:val="p"/>
-            </m:rPr>
-            <w:rPr>
-              <w:rStyle w:val="a4"/>
-              <w:rFonts w:ascii="Cambria Math" w:hAnsi="Cambria Math"/>
-            </w:rPr>
-            <m:t>1</m:t>
+            <m:t>-2</m:t>
           </m:r>
           <m:r>
             <w:rPr>
               <w:rFonts w:ascii="Cambria Math" w:hAnsi="Cambria Math"/>
             </w:rPr>
-            <m:t>∙</m:t>
+            <m:t>∙0)=0.03&gt;0</m:t>
           </m:r>
+        </m:oMath>
+      </m:oMathPara>
+    </w:p>
+    <w:p>
+      <w:pPr>
+        <w:pStyle w:val="a3"/>
+        <w:rPr>
+          <w:rFonts w:eastAsiaTheme="minorEastAsia"/>
+          <w:i/>
+        </w:rPr>
+      </w:pPr>
+      <m:oMathPara>
+        <m:oMath>
+          <m:sSub>
+            <m:sSubPr>
+              <m:ctrlPr>
+                <w:rPr>
+                  <w:rFonts w:ascii="Cambria Math" w:hAnsi="Cambria Math"/>
+                  <w:i/>
+                </w:rPr>
+              </m:ctrlPr>
+            </m:sSubPr>
+            <m:e>
+              <m:r>
+                <w:rPr>
+                  <w:rFonts w:ascii="Cambria Math" w:hAnsi="Cambria Math"/>
+                </w:rPr>
+                <m:t>∆</m:t>
+              </m:r>
+            </m:e>
+            <m:sub>
+              <m:r>
+                <w:rPr>
+                  <w:rFonts w:ascii="Cambria Math" w:hAnsi="Cambria Math"/>
+                </w:rPr>
+                <m:t>4</m:t>
+              </m:r>
+            </m:sub>
+          </m:sSub>
           <m:r>
             <w:rPr>
               <w:rFonts w:ascii="Cambria Math" w:hAnsi="Cambria Math"/>
             </w:rPr>
-            <m:t>(</m:t>
+            <m:t>=det</m:t>
           </m:r>
+          <m:d>
+            <m:dPr>
+              <m:ctrlPr>
+                <w:rPr>
+                  <w:rFonts w:ascii="Cambria Math" w:eastAsiaTheme="minorEastAsia" w:hAnsi="Cambria Math"/>
+                  <w:lang w:val="en-US"/>
+                </w:rPr>
+              </m:ctrlPr>
+            </m:dPr>
+            <m:e>
+              <m:m>
+                <m:mPr>
+                  <m:mcs>
+                    <m:mc>
+                      <m:mcPr>
+                        <m:count m:val="4"/>
+                        <m:mcJc m:val="center"/>
+                      </m:mcPr>
+                    </m:mc>
+                  </m:mcs>
+                  <m:ctrlPr>
+                    <w:rPr>
+                      <w:rFonts w:ascii="Cambria Math" w:eastAsia="Cambria Math" w:hAnsi="Cambria Math" w:cs="Cambria Math"/>
+                      <w:lang w:val="en-US"/>
+                    </w:rPr>
+                  </m:ctrlPr>
+                </m:mPr>
+                <m:mr>
+                  <m:e>
+                    <m:r>
+                      <w:rPr>
+                        <w:rFonts w:ascii="Cambria Math" w:hAnsi="Cambria Math"/>
+                        <w:lang w:val="en-US"/>
+                      </w:rPr>
+                      <m:t>0.1</m:t>
+                    </m:r>
+                    <m:ctrlPr>
+                      <w:rPr>
+                        <w:rFonts w:ascii="Cambria Math" w:hAnsi="Cambria Math"/>
+                        <w:i/>
+                        <w:lang w:val="en-US"/>
+                      </w:rPr>
+                    </m:ctrlPr>
+                  </m:e>
+                  <m:e>
+                    <m:r>
+                      <w:rPr>
+                        <w:rFonts w:ascii="Cambria Math" w:hAnsi="Cambria Math"/>
+                        <w:lang w:val="en-US"/>
+                      </w:rPr>
+                      <m:t>1</m:t>
+                    </m:r>
+                    <m:ctrlPr>
+                      <w:rPr>
+                        <w:rFonts w:ascii="Cambria Math" w:hAnsi="Cambria Math"/>
+                        <w:i/>
+                        <w:lang w:val="en-US"/>
+                      </w:rPr>
+                    </m:ctrlPr>
+                  </m:e>
+                  <m:e>
+                    <m:r>
+                      <w:rPr>
+                        <w:rFonts w:ascii="Cambria Math" w:hAnsi="Cambria Math"/>
+                        <w:lang w:val="en-US"/>
+                      </w:rPr>
+                      <m:t>0</m:t>
+                    </m:r>
+                    <m:ctrlPr>
+                      <w:rPr>
+                        <w:rFonts w:ascii="Cambria Math" w:hAnsi="Cambria Math"/>
+                        <w:i/>
+                        <w:lang w:val="en-US"/>
+                      </w:rPr>
+                    </m:ctrlPr>
+                  </m:e>
+                  <m:e>
+                    <m:r>
+                      <w:rPr>
+                        <w:rFonts w:ascii="Cambria Math" w:hAnsi="Cambria Math"/>
+                        <w:lang w:val="en-US"/>
+                      </w:rPr>
+                      <m:t>0</m:t>
+                    </m:r>
+                    <m:ctrlPr>
+                      <w:rPr>
+                        <w:rFonts w:ascii="Cambria Math" w:hAnsi="Cambria Math"/>
+                        <w:i/>
+                        <w:lang w:val="en-US"/>
+                      </w:rPr>
+                    </m:ctrlPr>
+                  </m:e>
+                </m:mr>
+                <m:mr>
+                  <m:e>
+                    <m:r>
+                      <w:rPr>
+                        <w:rFonts w:ascii="Cambria Math" w:hAnsi="Cambria Math"/>
+                        <w:lang w:val="en-US"/>
+                      </w:rPr>
+                      <m:t>0.05</m:t>
+                    </m:r>
+                    <m:ctrlPr>
+                      <w:rPr>
+                        <w:rFonts w:ascii="Cambria Math" w:hAnsi="Cambria Math"/>
+                        <w:i/>
+                        <w:lang w:val="en-US"/>
+                      </w:rPr>
+                    </m:ctrlPr>
+                  </m:e>
+                  <m:e>
+                    <m:r>
+                      <w:rPr>
+                        <w:rFonts w:ascii="Cambria Math" w:hAnsi="Cambria Math"/>
+                        <w:lang w:val="en-US"/>
+                      </w:rPr>
+                      <m:t>1</m:t>
+                    </m:r>
+                    <m:ctrlPr>
+                      <w:rPr>
+                        <w:rFonts w:ascii="Cambria Math" w:hAnsi="Cambria Math"/>
+                        <w:i/>
+                        <w:lang w:val="en-US"/>
+                      </w:rPr>
+                    </m:ctrlPr>
+                  </m:e>
+                  <m:e>
+                    <m:r>
+                      <w:rPr>
+                        <w:rFonts w:ascii="Cambria Math" w:hAnsi="Cambria Math"/>
+                        <w:lang w:val="en-US"/>
+                      </w:rPr>
+                      <m:t>2</m:t>
+                    </m:r>
+                    <m:ctrlPr>
+                      <w:rPr>
+                        <w:rFonts w:ascii="Cambria Math" w:hAnsi="Cambria Math"/>
+                        <w:i/>
+                        <w:lang w:val="en-US"/>
+                      </w:rPr>
+                    </m:ctrlPr>
+                  </m:e>
+                  <m:e>
+                    <m:r>
+                      <w:rPr>
+                        <w:rFonts w:ascii="Cambria Math" w:hAnsi="Cambria Math"/>
+                        <w:lang w:val="en-US"/>
+                      </w:rPr>
+                      <m:t>0</m:t>
+                    </m:r>
+                    <m:ctrlPr>
+                      <w:rPr>
+                        <w:rFonts w:ascii="Cambria Math" w:hAnsi="Cambria Math"/>
+                        <w:i/>
+                        <w:lang w:val="en-US"/>
+                      </w:rPr>
+                    </m:ctrlPr>
+                  </m:e>
+                </m:mr>
+                <m:mr>
+                  <m:e>
+                    <m:r>
+                      <w:rPr>
+                        <w:rFonts w:ascii="Cambria Math" w:hAnsi="Cambria Math"/>
+                        <w:lang w:val="en-US"/>
+                      </w:rPr>
+                      <m:t>0</m:t>
+                    </m:r>
+                    <m:ctrlPr>
+                      <w:rPr>
+                        <w:rFonts w:ascii="Cambria Math" w:hAnsi="Cambria Math"/>
+                        <w:i/>
+                        <w:lang w:val="en-US"/>
+                      </w:rPr>
+                    </m:ctrlPr>
+                  </m:e>
+                  <m:e>
+                    <m:r>
+                      <w:rPr>
+                        <w:rFonts w:ascii="Cambria Math" w:hAnsi="Cambria Math"/>
+                        <w:lang w:val="en-US"/>
+                      </w:rPr>
+                      <m:t>0.1</m:t>
+                    </m:r>
+                    <m:ctrlPr>
+                      <w:rPr>
+                        <w:rFonts w:ascii="Cambria Math" w:hAnsi="Cambria Math"/>
+                        <w:i/>
+                        <w:lang w:val="en-US"/>
+                      </w:rPr>
+                    </m:ctrlPr>
+                  </m:e>
+                  <m:e>
+                    <m:r>
+                      <w:rPr>
+                        <w:rFonts w:ascii="Cambria Math" w:hAnsi="Cambria Math"/>
+                        <w:lang w:val="en-US"/>
+                      </w:rPr>
+                      <m:t>1</m:t>
+                    </m:r>
+                    <m:ctrlPr>
+                      <w:rPr>
+                        <w:rFonts w:ascii="Cambria Math" w:hAnsi="Cambria Math"/>
+                        <w:i/>
+                        <w:lang w:val="en-US"/>
+                      </w:rPr>
+                    </m:ctrlPr>
+                  </m:e>
+                  <m:e>
+                    <m:r>
+                      <w:rPr>
+                        <w:rFonts w:ascii="Cambria Math" w:hAnsi="Cambria Math"/>
+                        <w:lang w:val="en-US"/>
+                      </w:rPr>
+                      <m:t>0</m:t>
+                    </m:r>
+                    <m:ctrlPr>
+                      <w:rPr>
+                        <w:rFonts w:ascii="Cambria Math" w:hAnsi="Cambria Math"/>
+                        <w:i/>
+                        <w:lang w:val="en-US"/>
+                      </w:rPr>
+                    </m:ctrlPr>
+                  </m:e>
+                </m:mr>
+                <m:mr>
+                  <m:e>
+                    <m:r>
+                      <w:rPr>
+                        <w:rFonts w:ascii="Cambria Math" w:hAnsi="Cambria Math"/>
+                        <w:lang w:val="en-US"/>
+                      </w:rPr>
+                      <m:t>0</m:t>
+                    </m:r>
+                    <m:ctrlPr>
+                      <w:rPr>
+                        <w:rFonts w:ascii="Cambria Math" w:hAnsi="Cambria Math"/>
+                        <w:i/>
+                        <w:lang w:val="en-US"/>
+                      </w:rPr>
+                    </m:ctrlPr>
+                  </m:e>
+                  <m:e>
+                    <m:r>
+                      <w:rPr>
+                        <w:rFonts w:ascii="Cambria Math" w:hAnsi="Cambria Math"/>
+                        <w:lang w:val="en-US"/>
+                      </w:rPr>
+                      <m:t>0.05</m:t>
+                    </m:r>
+                    <m:ctrlPr>
+                      <w:rPr>
+                        <w:rFonts w:ascii="Cambria Math" w:hAnsi="Cambria Math"/>
+                        <w:i/>
+                        <w:lang w:val="en-US"/>
+                      </w:rPr>
+                    </m:ctrlPr>
+                  </m:e>
+                  <m:e>
+                    <m:r>
+                      <w:rPr>
+                        <w:rFonts w:ascii="Cambria Math" w:hAnsi="Cambria Math"/>
+                        <w:lang w:val="en-US"/>
+                      </w:rPr>
+                      <m:t>1</m:t>
+                    </m:r>
+                    <m:ctrlPr>
+                      <w:rPr>
+                        <w:rFonts w:ascii="Cambria Math" w:hAnsi="Cambria Math"/>
+                        <w:i/>
+                        <w:lang w:val="en-US"/>
+                      </w:rPr>
+                    </m:ctrlPr>
+                  </m:e>
+                  <m:e>
+                    <m:r>
+                      <w:rPr>
+                        <w:rFonts w:ascii="Cambria Math" w:hAnsi="Cambria Math"/>
+                        <w:lang w:val="en-US"/>
+                      </w:rPr>
+                      <m:t>2</m:t>
+                    </m:r>
+                    <m:ctrlPr>
+                      <w:rPr>
+                        <w:rFonts w:ascii="Cambria Math" w:eastAsiaTheme="minorEastAsia" w:hAnsi="Cambria Math"/>
+                        <w:i/>
+                        <w:lang w:val="en-US"/>
+                      </w:rPr>
+                    </m:ctrlPr>
+                  </m:e>
+                </m:mr>
+              </m:m>
+              <m:ctrlPr>
+                <w:rPr>
+                  <w:rFonts w:ascii="Cambria Math" w:eastAsiaTheme="minorEastAsia" w:hAnsi="Cambria Math"/>
+                  <w:i/>
+                  <w:lang w:val="en-US"/>
+                </w:rPr>
+              </m:ctrlPr>
+            </m:e>
+          </m:d>
+          <m:r>
+            <w:rPr>
+              <w:rFonts w:ascii="Cambria Math" w:eastAsiaTheme="minorEastAsia" w:hAnsi="Cambria Math"/>
+              <w:lang w:val="en-US"/>
+            </w:rPr>
+            <m:t>=</m:t>
+          </m:r>
+          <m:sSub>
+            <m:sSubPr>
+              <m:ctrlPr>
+                <w:rPr>
+                  <w:rFonts w:ascii="Cambria Math" w:hAnsi="Cambria Math"/>
+                  <w:i/>
+                </w:rPr>
+              </m:ctrlPr>
+            </m:sSubPr>
+            <m:e>
+              <m:r>
+                <w:rPr>
+                  <w:rFonts w:ascii="Cambria Math" w:hAnsi="Cambria Math"/>
+                </w:rPr>
+                <m:t>∆</m:t>
+              </m:r>
+            </m:e>
+            <m:sub>
+              <m:r>
+                <w:rPr>
+                  <w:rFonts w:ascii="Cambria Math" w:hAnsi="Cambria Math"/>
+                </w:rPr>
+                <m:t>3</m:t>
+              </m:r>
+            </m:sub>
+          </m:sSub>
           <m:r>
             <w:rPr>
               <w:rFonts w:ascii="Cambria Math" w:hAnsi="Cambria Math"/>
             </w:rPr>
-            <m:t>0.05∙1</m:t>
-          </m:r>
-          <m:r>
-            <m:rPr>
-              <m:sty m:val="p"/>
-            </m:rPr>
-            <w:rPr>
-              <w:rStyle w:val="a4"/>
-              <w:rFonts w:ascii="Cambria Math" w:hAnsi="Cambria Math"/>
-            </w:rPr>
-            <m:t>-</m:t>
-          </m:r>
-          <m:r>
-            <m:rPr>
-              <m:sty m:val="p"/>
-            </m:rPr>
-            <w:rPr>
-              <w:rStyle w:val="a4"/>
-              <w:rFonts w:ascii="Cambria Math" w:hAnsi="Cambria Math"/>
-            </w:rPr>
-            <m:t>2</m:t>
-          </m:r>
-          <m:r>
-            <w:rPr>
-              <w:rFonts w:ascii="Cambria Math" w:hAnsi="Cambria Math"/>
-            </w:rPr>
-            <m:t>∙</m:t>
-          </m:r>
-          <m:r>
-            <w:rPr>
-              <w:rFonts w:ascii="Cambria Math" w:hAnsi="Cambria Math"/>
-            </w:rPr>
-            <m:t>0)</m:t>
-          </m:r>
-          <m:r>
-            <w:rPr>
-              <w:rFonts w:ascii="Cambria Math" w:hAnsi="Cambria Math"/>
-            </w:rPr>
-            <m:t>=0.0</m:t>
-          </m:r>
-          <m:r>
-            <w:rPr>
-              <w:rFonts w:ascii="Cambria Math" w:hAnsi="Cambria Math"/>
-            </w:rPr>
-            <m:t>3</m:t>
-          </m:r>
-          <m:r>
-            <w:rPr>
-              <w:rFonts w:ascii="Cambria Math" w:hAnsi="Cambria Math"/>
-            </w:rPr>
-            <m:t>&gt;0</m:t>
+            <m:t>∙2=0.06&gt;0</m:t>
           </m:r>
         </m:oMath>
       </m:oMathPara>
@@ -3192,13 +3242,7 @@
                 <w:rPr>
                   <w:rFonts w:ascii="Cambria Math" w:eastAsiaTheme="minorEastAsia" w:hAnsi="Cambria Math"/>
                 </w:rPr>
-                <m:t>0,</m:t>
-              </m:r>
-              <m:r>
-                <w:rPr>
-                  <w:rFonts w:ascii="Cambria Math" w:eastAsiaTheme="minorEastAsia" w:hAnsi="Cambria Math"/>
-                </w:rPr>
-                <m:t>05</m:t>
+                <m:t>0,05</m:t>
               </m:r>
               <m:sSup>
                 <m:sSupPr>
@@ -3248,13 +3292,7 @@
                 <w:rPr>
                   <w:rFonts w:ascii="Cambria Math" w:eastAsiaTheme="minorEastAsia" w:hAnsi="Cambria Math"/>
                 </w:rPr>
-                <m:t>+0,</m:t>
-              </m:r>
-              <m:r>
-                <w:rPr>
-                  <w:rFonts w:ascii="Cambria Math" w:eastAsiaTheme="minorEastAsia" w:hAnsi="Cambria Math"/>
-                </w:rPr>
-                <m:t>1</m:t>
+                <m:t>+0,1</m:t>
               </m:r>
               <m:sSup>
                 <m:sSupPr>
@@ -3366,13 +3404,7 @@
                 <w:rPr>
                   <w:rFonts w:ascii="Cambria Math" w:eastAsiaTheme="minorEastAsia" w:hAnsi="Cambria Math"/>
                 </w:rPr>
-                <m:t>+</m:t>
-              </m:r>
-              <m:r>
-                <w:rPr>
-                  <w:rFonts w:ascii="Cambria Math" w:eastAsiaTheme="minorEastAsia" w:hAnsi="Cambria Math"/>
-                </w:rPr>
-                <m:t>1</m:t>
+                <m:t>+1</m:t>
               </m:r>
             </m:den>
           </m:f>
@@ -3409,13 +3441,7 @@
                 <w:rPr>
                   <w:rFonts w:ascii="Cambria Math" w:eastAsiaTheme="minorEastAsia" w:hAnsi="Cambria Math"/>
                 </w:rPr>
-                <m:t>0,</m:t>
-              </m:r>
-              <m:r>
-                <w:rPr>
-                  <w:rFonts w:ascii="Cambria Math" w:eastAsiaTheme="minorEastAsia" w:hAnsi="Cambria Math"/>
-                </w:rPr>
-                <m:t>05</m:t>
+                <m:t>0,05</m:t>
               </m:r>
               <m:sSup>
                 <m:sSupPr>
@@ -3456,13 +3482,7 @@
                 <w:rPr>
                   <w:rFonts w:ascii="Cambria Math" w:eastAsiaTheme="minorEastAsia" w:hAnsi="Cambria Math"/>
                 </w:rPr>
-                <m:t>0,</m:t>
-              </m:r>
-              <m:r>
-                <w:rPr>
-                  <w:rFonts w:ascii="Cambria Math" w:eastAsiaTheme="minorEastAsia" w:hAnsi="Cambria Math"/>
-                </w:rPr>
-                <m:t>1</m:t>
+                <m:t>0,1</m:t>
               </m:r>
               <m:sSup>
                 <m:sSupPr>
@@ -3541,13 +3561,7 @@
                 <w:rPr>
                   <w:rFonts w:ascii="Cambria Math" w:eastAsiaTheme="minorEastAsia" w:hAnsi="Cambria Math"/>
                 </w:rPr>
-                <m:t>+</m:t>
-              </m:r>
-              <m:r>
-                <w:rPr>
-                  <w:rFonts w:ascii="Cambria Math" w:eastAsiaTheme="minorEastAsia" w:hAnsi="Cambria Math"/>
-                </w:rPr>
-                <m:t>1</m:t>
+                <m:t>+1</m:t>
               </m:r>
             </m:den>
           </m:f>
@@ -3593,13 +3607,7 @@
                 <w:rPr>
                   <w:rFonts w:ascii="Cambria Math" w:eastAsiaTheme="minorEastAsia" w:hAnsi="Cambria Math"/>
                 </w:rPr>
-                <m:t>0,</m:t>
-              </m:r>
-              <m:r>
-                <w:rPr>
-                  <w:rFonts w:ascii="Cambria Math" w:eastAsiaTheme="minorEastAsia" w:hAnsi="Cambria Math"/>
-                </w:rPr>
-                <m:t>05</m:t>
+                <m:t>0,05</m:t>
               </m:r>
               <m:sSup>
                 <m:sSupPr>
@@ -3649,25 +3657,7 @@
                 <w:rPr>
                   <w:rFonts w:ascii="Cambria Math" w:hAnsi="Cambria Math"/>
                 </w:rPr>
-                <m:t>²</m:t>
-              </m:r>
-              <m:r>
-                <m:rPr>
-                  <m:sty m:val="p"/>
-                </m:rPr>
-                <w:rPr>
-                  <w:rFonts w:ascii="Cambria Math" w:hAnsi="Cambria Math"/>
-                </w:rPr>
-                <m:t>+1</m:t>
-              </m:r>
-              <m:r>
-                <m:rPr>
-                  <m:sty m:val="p"/>
-                </m:rPr>
-                <w:rPr>
-                  <w:rFonts w:ascii="Cambria Math" w:hAnsi="Cambria Math"/>
-                </w:rPr>
-                <m:t xml:space="preserve">) + </m:t>
+                <m:t xml:space="preserve">²+1) + </m:t>
               </m:r>
               <m:r>
                 <w:rPr>
@@ -3703,13 +3693,7 @@
                 <w:rPr>
                   <w:rFonts w:ascii="Cambria Math" w:eastAsiaTheme="minorEastAsia" w:hAnsi="Cambria Math"/>
                 </w:rPr>
-                <m:t>0,</m:t>
-              </m:r>
-              <m:r>
-                <w:rPr>
-                  <w:rFonts w:ascii="Cambria Math" w:eastAsiaTheme="minorEastAsia" w:hAnsi="Cambria Math"/>
-                </w:rPr>
-                <m:t>1</m:t>
+                <m:t>0,1</m:t>
               </m:r>
               <m:sSup>
                 <m:sSupPr>
@@ -3798,19 +3782,7 @@
           <w:rPr>
             <w:rFonts w:ascii="Cambria Math" w:eastAsiaTheme="minorEastAsia" w:hAnsi="Cambria Math"/>
           </w:rPr>
-          <m:t>=</m:t>
-        </m:r>
-        <m:r>
-          <w:rPr>
-            <w:rFonts w:ascii="Cambria Math" w:eastAsiaTheme="minorEastAsia" w:hAnsi="Cambria Math"/>
-          </w:rPr>
-          <m:t>0,</m:t>
-        </m:r>
-        <m:r>
-          <w:rPr>
-            <w:rFonts w:ascii="Cambria Math" w:eastAsiaTheme="minorEastAsia" w:hAnsi="Cambria Math"/>
-          </w:rPr>
-          <m:t>05</m:t>
+          <m:t>=0,05</m:t>
         </m:r>
         <m:sSup>
           <m:sSupPr>
@@ -3874,31 +3846,13 @@
           <w:rPr>
             <w:rFonts w:ascii="Cambria Math" w:eastAsiaTheme="minorEastAsia" w:hAnsi="Cambria Math"/>
           </w:rPr>
-          <m:t>B</m:t>
-        </m:r>
-        <m:r>
-          <w:rPr>
-            <w:rFonts w:ascii="Cambria Math" w:eastAsiaTheme="minorEastAsia" w:hAnsi="Cambria Math"/>
-          </w:rPr>
-          <m:t>(</m:t>
+          <m:t>B(</m:t>
         </m:r>
         <m:r>
           <w:rPr>
             <w:rFonts w:ascii="Cambria Math" w:hAnsi="Cambria Math"/>
           </w:rPr>
-          <m:t>ω)</m:t>
-        </m:r>
-        <m:r>
-          <w:rPr>
-            <w:rFonts w:ascii="Cambria Math" w:hAnsi="Cambria Math"/>
-          </w:rPr>
-          <m:t>=</m:t>
-        </m:r>
-        <m:r>
-          <w:rPr>
-            <w:rFonts w:ascii="Cambria Math" w:hAnsi="Cambria Math"/>
-          </w:rPr>
-          <m:t>ω</m:t>
+          <m:t>ω)=ω</m:t>
         </m:r>
         <m:r>
           <m:rPr>
@@ -3913,13 +3867,7 @@
           <w:rPr>
             <w:rFonts w:ascii="Cambria Math" w:eastAsiaTheme="minorEastAsia" w:hAnsi="Cambria Math"/>
           </w:rPr>
-          <m:t>0,</m:t>
-        </m:r>
-        <m:r>
-          <w:rPr>
-            <w:rFonts w:ascii="Cambria Math" w:eastAsiaTheme="minorEastAsia" w:hAnsi="Cambria Math"/>
-          </w:rPr>
-          <m:t>1</m:t>
+          <m:t>0,1</m:t>
         </m:r>
         <m:sSup>
           <m:sSupPr>
@@ -4075,13 +4023,7 @@
                 <w:rPr>
                   <w:rFonts w:ascii="Cambria Math" w:eastAsiaTheme="minorEastAsia" w:hAnsi="Cambria Math"/>
                 </w:rPr>
-                <m:t>B</m:t>
-              </m:r>
-              <m:r>
-                <w:rPr>
-                  <w:rFonts w:ascii="Cambria Math" w:eastAsiaTheme="minorEastAsia" w:hAnsi="Cambria Math"/>
-                </w:rPr>
-                <m:t>(</m:t>
+                <m:t>B(</m:t>
               </m:r>
               <m:r>
                 <w:rPr>
@@ -4133,13 +4075,7 @@
                 <w:rPr>
                   <w:rFonts w:ascii="Cambria Math" w:hAnsi="Cambria Math"/>
                 </w:rPr>
-                <m:t>ω)</m:t>
-              </m:r>
-              <m:r>
-                <w:rPr>
-                  <w:rFonts w:ascii="Cambria Math" w:hAnsi="Cambria Math"/>
-                </w:rPr>
-                <m:t>+</m:t>
+                <m:t>ω)+</m:t>
               </m:r>
               <m:sSup>
                 <m:sSupPr>
@@ -4195,16 +4131,14 @@
         <w:pStyle w:val="a3"/>
       </w:pPr>
       <w:r>
-        <w:t xml:space="preserve">Отсюда </w:t>
-      </w:r>
-      <w:r>
-        <w:t>вещественная и мнимая части:</w:t>
+        <w:t>Отсюда вещественная и мнимая части:</w:t>
       </w:r>
     </w:p>
     <w:p>
       <w:pPr>
         <w:pStyle w:val="a3"/>
         <w:rPr>
+          <w:rFonts w:eastAsiaTheme="minorEastAsia"/>
           <w:i/>
         </w:rPr>
       </w:pPr>
@@ -4230,13 +4164,7 @@
             <w:rPr>
               <w:rFonts w:ascii="Cambria Math" w:hAnsi="Cambria Math"/>
             </w:rPr>
-            <m:t>ω)</m:t>
-          </m:r>
-          <m:r>
-            <w:rPr>
-              <w:rFonts w:ascii="Cambria Math" w:hAnsi="Cambria Math"/>
-            </w:rPr>
-            <m:t>=</m:t>
+            <m:t>ω)=</m:t>
           </m:r>
           <m:f>
             <m:fPr>
@@ -4314,13 +4242,7 @@
                 <w:rPr>
                   <w:rFonts w:ascii="Cambria Math" w:hAnsi="Cambria Math"/>
                 </w:rPr>
-                <m:t>ω)</m:t>
-              </m:r>
-              <m:r>
-                <w:rPr>
-                  <w:rFonts w:ascii="Cambria Math" w:hAnsi="Cambria Math"/>
-                </w:rPr>
-                <m:t>+</m:t>
+                <m:t>ω)+</m:t>
               </m:r>
               <m:sSup>
                 <m:sSupPr>
@@ -4388,13 +4310,7 @@
             <w:rPr>
               <w:rFonts w:ascii="Cambria Math" w:hAnsi="Cambria Math"/>
             </w:rPr>
-            <m:t>ω)</m:t>
-          </m:r>
-          <m:r>
-            <w:rPr>
-              <w:rFonts w:ascii="Cambria Math" w:hAnsi="Cambria Math"/>
-            </w:rPr>
-            <m:t>=</m:t>
+            <m:t>ω)=</m:t>
           </m:r>
           <m:f>
             <m:fPr>
@@ -4419,13 +4335,7 @@
                 <w:rPr>
                   <w:rFonts w:ascii="Cambria Math" w:eastAsiaTheme="minorEastAsia" w:hAnsi="Cambria Math"/>
                 </w:rPr>
-                <m:t>B</m:t>
-              </m:r>
-              <m:r>
-                <w:rPr>
-                  <w:rFonts w:ascii="Cambria Math" w:eastAsiaTheme="minorEastAsia" w:hAnsi="Cambria Math"/>
-                </w:rPr>
-                <m:t>(</m:t>
+                <m:t>B(</m:t>
               </m:r>
               <m:r>
                 <w:rPr>
@@ -4477,13 +4387,7 @@
                 <w:rPr>
                   <w:rFonts w:ascii="Cambria Math" w:hAnsi="Cambria Math"/>
                 </w:rPr>
-                <m:t>ω)</m:t>
-              </m:r>
-              <m:r>
-                <w:rPr>
-                  <w:rFonts w:ascii="Cambria Math" w:hAnsi="Cambria Math"/>
-                </w:rPr>
-                <m:t>+</m:t>
+                <m:t>ω)+</m:t>
               </m:r>
               <m:sSup>
                 <m:sSupPr>
@@ -4528,8 +4432,1713 @@
         </m:oMath>
       </m:oMathPara>
     </w:p>
+    <w:p>
+      <w:pPr>
+        <w:pStyle w:val="a3"/>
+        <w:rPr>
+          <w:rFonts w:ascii="SchoolBookC-Italic" w:hAnsi="SchoolBookC-Italic" w:cs="SchoolBookC-Italic"/>
+          <w:i/>
+          <w:iCs/>
+        </w:rPr>
+      </w:pPr>
+      <w:r>
+        <w:t>АФЧХ</w:t>
+      </w:r>
+      <w:r>
+        <w:t xml:space="preserve"> разомкнутой системы, не имеющей интегрирующих звеньев, при </w:t>
+      </w:r>
+      <w:r>
+        <w:rPr>
+          <w:rFonts w:hint="eastAsia"/>
+        </w:rPr>
+        <w:t xml:space="preserve"> </w:t>
+      </w:r>
+      <m:oMath>
+        <m:r>
+          <w:rPr>
+            <w:rFonts w:ascii="Cambria Math" w:hAnsi="Cambria Math"/>
+          </w:rPr>
+          <m:t>ω</m:t>
+        </m:r>
+      </m:oMath>
+      <w:r>
+        <w:t xml:space="preserve">  = 0 начинается на вещественной оси в точке </w:t>
+      </w:r>
+      <m:oMath>
+        <m:r>
+          <w:rPr>
+            <w:rFonts w:ascii="Cambria Math" w:hAnsi="Cambria Math"/>
+          </w:rPr>
+          <m:t>P</m:t>
+        </m:r>
+        <m:r>
+          <m:rPr>
+            <m:sty m:val="p"/>
+          </m:rPr>
+          <w:rPr>
+            <w:rFonts w:ascii="Cambria Math" w:hAnsi="Cambria Math"/>
+          </w:rPr>
+          <m:t>(</m:t>
+        </m:r>
+        <m:r>
+          <w:rPr>
+            <w:rFonts w:ascii="Cambria Math" w:hAnsi="Cambria Math"/>
+          </w:rPr>
+          <m:t>ω)</m:t>
+        </m:r>
+        <m:r>
+          <w:rPr>
+            <w:rFonts w:ascii="Cambria Math" w:hAnsi="Cambria Math"/>
+          </w:rPr>
+          <m:t>=K</m:t>
+        </m:r>
+      </m:oMath>
+      <w:r>
+        <w:t xml:space="preserve"> (где K – коэффициент усиления разомкнутой системы). Заканчивается АФЧХ в начале координат при</w:t>
+      </w:r>
+      <w:r>
+        <w:rPr>
+          <w:rFonts w:ascii="SchoolBookC" w:cs="SchoolBookC"/>
+        </w:rPr>
+        <w:t xml:space="preserve"> </w:t>
+      </w:r>
+      <w:r>
+        <w:rPr>
+          <w:rFonts w:ascii="Cambria Math" w:hAnsi="Cambria Math"/>
+          <w:i/>
+        </w:rPr>
+        <w:br/>
+      </w:r>
+      <m:oMath>
+        <m:r>
+          <w:rPr>
+            <w:rFonts w:ascii="Cambria Math" w:hAnsi="Cambria Math"/>
+          </w:rPr>
+          <m:t>ω</m:t>
+        </m:r>
+        <m:r>
+          <w:rPr>
+            <w:rFonts w:ascii="Cambria Math" w:hAnsi="Cambria Math"/>
+          </w:rPr>
+          <m:t>→∞</m:t>
+        </m:r>
+      </m:oMath>
+      <w:r>
+        <w:rPr>
+          <w:rFonts w:hint="eastAsia"/>
+        </w:rPr>
+        <w:t xml:space="preserve"> </w:t>
+      </w:r>
+      <w:r>
+        <w:t>.</w:t>
+      </w:r>
+    </w:p>
+    <w:p>
+      <w:pPr>
+        <w:pStyle w:val="a3"/>
+        <w:rPr>
+          <w:rFonts w:ascii="SchoolBookC-Italic" w:hAnsi="SchoolBookC-Italic" w:cs="SchoolBookC-Italic"/>
+          <w:i/>
+          <w:iCs/>
+        </w:rPr>
+      </w:pPr>
+    </w:p>
+    <w:p>
+      <w:pPr>
+        <w:pStyle w:val="a3"/>
+        <w:rPr>
+          <w:rFonts w:ascii="SchoolBookC-Italic" w:hAnsi="SchoolBookC-Italic" w:cs="SchoolBookC-Italic"/>
+          <w:i/>
+          <w:iCs/>
+        </w:rPr>
+      </w:pPr>
+    </w:p>
+    <w:p>
+      <w:pPr>
+        <w:pStyle w:val="a3"/>
+        <w:rPr>
+          <w:rFonts w:asciiTheme="minorHAnsi" w:hAnsiTheme="minorHAnsi" w:cs="SchoolBookC"/>
+        </w:rPr>
+      </w:pPr>
+    </w:p>
+    <w:p>
+      <w:pPr>
+        <w:pStyle w:val="a3"/>
+        <w:rPr>
+          <w:rFonts w:asciiTheme="minorHAnsi" w:hAnsiTheme="minorHAnsi" w:cs="SchoolBookC"/>
+        </w:rPr>
+      </w:pPr>
+    </w:p>
+    <w:p>
+      <w:pPr>
+        <w:pStyle w:val="a3"/>
+        <w:rPr>
+          <w:rFonts w:asciiTheme="minorHAnsi" w:hAnsiTheme="minorHAnsi" w:cs="SchoolBookC"/>
+          <w:lang w:val="en-US"/>
+        </w:rPr>
+      </w:pPr>
+    </w:p>
+    <w:p>
+      <w:pPr>
+        <w:pStyle w:val="a3"/>
+      </w:pPr>
+      <w:r>
+        <w:t xml:space="preserve">Точки для построения </w:t>
+      </w:r>
+      <w:proofErr w:type="spellStart"/>
+      <w:r>
+        <w:t>гад</w:t>
+      </w:r>
+      <w:r>
+        <w:t>о</w:t>
+      </w:r>
+      <w:r>
+        <w:t>графа</w:t>
+      </w:r>
+      <w:proofErr w:type="spellEnd"/>
+    </w:p>
+    <w:tbl>
+      <w:tblPr>
+        <w:tblStyle w:val="a5"/>
+        <w:tblW w:w="0" w:type="auto"/>
+        <w:jc w:val="center"/>
+        <w:tblLook w:val="04A0" w:firstRow="1" w:lastRow="0" w:firstColumn="1" w:lastColumn="0" w:noHBand="0" w:noVBand="1"/>
+      </w:tblPr>
+      <w:tblGrid>
+        <w:gridCol w:w="988"/>
+        <w:gridCol w:w="992"/>
+        <w:gridCol w:w="992"/>
+        <w:gridCol w:w="1985"/>
+        <w:gridCol w:w="992"/>
+        <w:gridCol w:w="1134"/>
+      </w:tblGrid>
+      <w:tr>
+        <w:trPr>
+          <w:jc w:val="center"/>
+        </w:trPr>
+        <w:tc>
+          <w:tcPr>
+            <w:tcW w:w="988" w:type="dxa"/>
+          </w:tcPr>
+          <w:p>
+            <w:pPr>
+              <w:pStyle w:val="a3"/>
+              <w:ind w:firstLine="0"/>
+            </w:pPr>
+            <m:oMathPara>
+              <m:oMath>
+                <m:r>
+                  <w:rPr>
+                    <w:rFonts w:ascii="Cambria Math" w:hAnsi="Cambria Math"/>
+                  </w:rPr>
+                  <m:t>ω</m:t>
+                </m:r>
+              </m:oMath>
+            </m:oMathPara>
+          </w:p>
+        </w:tc>
+        <w:tc>
+          <w:tcPr>
+            <w:tcW w:w="992" w:type="dxa"/>
+          </w:tcPr>
+          <w:p>
+            <w:pPr>
+              <w:pStyle w:val="a3"/>
+              <w:ind w:firstLine="0"/>
+              <w:rPr>
+                <w:rFonts w:eastAsia="Calibri" w:cs="Times New Roman"/>
+                <w:lang w:val="en-US"/>
+              </w:rPr>
+            </w:pPr>
+            <m:oMathPara>
+              <m:oMath>
+                <m:r>
+                  <w:rPr>
+                    <w:rFonts w:ascii="Cambria Math" w:eastAsiaTheme="minorEastAsia" w:hAnsi="Cambria Math"/>
+                    <w:lang w:val="en-US"/>
+                  </w:rPr>
+                  <m:t>A</m:t>
+                </m:r>
+                <m:r>
+                  <m:rPr>
+                    <m:sty m:val="p"/>
+                  </m:rPr>
+                  <w:rPr>
+                    <w:rFonts w:ascii="Cambria Math" w:eastAsiaTheme="minorEastAsia" w:hAnsi="Cambria Math"/>
+                  </w:rPr>
+                  <m:t>(</m:t>
+                </m:r>
+                <m:r>
+                  <w:rPr>
+                    <w:rFonts w:ascii="Cambria Math" w:hAnsi="Cambria Math"/>
+                  </w:rPr>
+                  <m:t>ω)</m:t>
+                </m:r>
+              </m:oMath>
+            </m:oMathPara>
+          </w:p>
+        </w:tc>
+        <w:tc>
+          <w:tcPr>
+            <w:tcW w:w="992" w:type="dxa"/>
+          </w:tcPr>
+          <w:p>
+            <w:pPr>
+              <w:pStyle w:val="a3"/>
+              <w:ind w:firstLine="0"/>
+              <w:rPr>
+                <w:rFonts w:eastAsia="Calibri" w:cs="Times New Roman"/>
+                <w:lang w:val="en-US"/>
+              </w:rPr>
+            </w:pPr>
+            <m:oMathPara>
+              <m:oMath>
+                <m:r>
+                  <w:rPr>
+                    <w:rFonts w:ascii="Cambria Math" w:eastAsiaTheme="minorEastAsia" w:hAnsi="Cambria Math"/>
+                  </w:rPr>
+                  <m:t>B(</m:t>
+                </m:r>
+                <m:r>
+                  <w:rPr>
+                    <w:rFonts w:ascii="Cambria Math" w:hAnsi="Cambria Math"/>
+                  </w:rPr>
+                  <m:t>ω)</m:t>
+                </m:r>
+              </m:oMath>
+            </m:oMathPara>
+          </w:p>
+        </w:tc>
+        <w:tc>
+          <w:tcPr>
+            <w:tcW w:w="1985" w:type="dxa"/>
+          </w:tcPr>
+          <w:p>
+            <w:pPr>
+              <w:pStyle w:val="a3"/>
+              <w:ind w:firstLine="0"/>
+              <w:rPr>
+                <w:rFonts w:eastAsia="Calibri" w:cs="Times New Roman"/>
+                <w:lang w:val="en-US"/>
+              </w:rPr>
+            </w:pPr>
+            <m:oMathPara>
+              <m:oMath>
+                <m:sSup>
+                  <m:sSupPr>
+                    <m:ctrlPr>
+                      <w:rPr>
+                        <w:rFonts w:ascii="Cambria Math" w:eastAsiaTheme="minorEastAsia" w:hAnsi="Cambria Math"/>
+                        <w:i/>
+                        <w:lang w:val="en-US"/>
+                      </w:rPr>
+                    </m:ctrlPr>
+                  </m:sSupPr>
+                  <m:e>
+                    <m:r>
+                      <w:rPr>
+                        <w:rFonts w:ascii="Cambria Math" w:eastAsiaTheme="minorEastAsia" w:hAnsi="Cambria Math"/>
+                        <w:lang w:val="en-US"/>
+                      </w:rPr>
+                      <m:t>A</m:t>
+                    </m:r>
+                  </m:e>
+                  <m:sup>
+                    <m:r>
+                      <w:rPr>
+                        <w:rFonts w:ascii="Cambria Math" w:eastAsiaTheme="minorEastAsia" w:hAnsi="Cambria Math"/>
+                        <w:lang w:val="en-US"/>
+                      </w:rPr>
+                      <m:t>2</m:t>
+                    </m:r>
+                  </m:sup>
+                </m:sSup>
+                <m:r>
+                  <m:rPr>
+                    <m:sty m:val="p"/>
+                  </m:rPr>
+                  <w:rPr>
+                    <w:rFonts w:ascii="Cambria Math" w:eastAsiaTheme="minorEastAsia" w:hAnsi="Cambria Math"/>
+                  </w:rPr>
+                  <m:t>(</m:t>
+                </m:r>
+                <m:r>
+                  <w:rPr>
+                    <w:rFonts w:ascii="Cambria Math" w:hAnsi="Cambria Math"/>
+                  </w:rPr>
+                  <m:t>ω)+</m:t>
+                </m:r>
+                <m:sSup>
+                  <m:sSupPr>
+                    <m:ctrlPr>
+                      <w:rPr>
+                        <w:rFonts w:ascii="Cambria Math" w:eastAsiaTheme="minorEastAsia" w:hAnsi="Cambria Math"/>
+                        <w:i/>
+                      </w:rPr>
+                    </m:ctrlPr>
+                  </m:sSupPr>
+                  <m:e>
+                    <m:r>
+                      <w:rPr>
+                        <w:rFonts w:ascii="Cambria Math" w:eastAsiaTheme="minorEastAsia" w:hAnsi="Cambria Math"/>
+                      </w:rPr>
+                      <m:t>B</m:t>
+                    </m:r>
+                  </m:e>
+                  <m:sup>
+                    <m:r>
+                      <w:rPr>
+                        <w:rFonts w:ascii="Cambria Math" w:eastAsiaTheme="minorEastAsia" w:hAnsi="Cambria Math"/>
+                      </w:rPr>
+                      <m:t>2</m:t>
+                    </m:r>
+                  </m:sup>
+                </m:sSup>
+                <m:r>
+                  <w:rPr>
+                    <w:rFonts w:ascii="Cambria Math" w:eastAsiaTheme="minorEastAsia" w:hAnsi="Cambria Math"/>
+                  </w:rPr>
+                  <m:t>(</m:t>
+                </m:r>
+                <m:r>
+                  <w:rPr>
+                    <w:rFonts w:ascii="Cambria Math" w:hAnsi="Cambria Math"/>
+                  </w:rPr>
+                  <m:t>ω)</m:t>
+                </m:r>
+              </m:oMath>
+            </m:oMathPara>
+          </w:p>
+        </w:tc>
+        <w:tc>
+          <w:tcPr>
+            <w:tcW w:w="992" w:type="dxa"/>
+          </w:tcPr>
+          <w:p>
+            <w:pPr>
+              <w:pStyle w:val="a3"/>
+              <w:ind w:firstLine="0"/>
+            </w:pPr>
+            <m:oMathPara>
+              <m:oMath>
+                <m:r>
+                  <w:rPr>
+                    <w:rFonts w:ascii="Cambria Math" w:eastAsiaTheme="minorEastAsia" w:hAnsi="Cambria Math"/>
+                    <w:lang w:val="en-US"/>
+                  </w:rPr>
+                  <m:t>P</m:t>
+                </m:r>
+                <m:r>
+                  <m:rPr>
+                    <m:sty m:val="p"/>
+                  </m:rPr>
+                  <w:rPr>
+                    <w:rFonts w:ascii="Cambria Math" w:eastAsiaTheme="minorEastAsia" w:hAnsi="Cambria Math"/>
+                  </w:rPr>
+                  <m:t>(</m:t>
+                </m:r>
+                <m:r>
+                  <w:rPr>
+                    <w:rFonts w:ascii="Cambria Math" w:hAnsi="Cambria Math"/>
+                  </w:rPr>
+                  <m:t>ω)</m:t>
+                </m:r>
+              </m:oMath>
+            </m:oMathPara>
+          </w:p>
+        </w:tc>
+        <w:tc>
+          <w:tcPr>
+            <w:tcW w:w="1134" w:type="dxa"/>
+          </w:tcPr>
+          <w:p>
+            <w:pPr>
+              <w:pStyle w:val="a3"/>
+              <w:ind w:firstLine="0"/>
+            </w:pPr>
+            <m:oMathPara>
+              <m:oMath>
+                <m:r>
+                  <w:rPr>
+                    <w:rFonts w:ascii="Cambria Math" w:eastAsiaTheme="minorEastAsia" w:hAnsi="Cambria Math"/>
+                    <w:lang w:val="en-US"/>
+                  </w:rPr>
+                  <m:t>Q</m:t>
+                </m:r>
+                <m:r>
+                  <m:rPr>
+                    <m:sty m:val="p"/>
+                  </m:rPr>
+                  <w:rPr>
+                    <w:rFonts w:ascii="Cambria Math" w:eastAsiaTheme="minorEastAsia" w:hAnsi="Cambria Math"/>
+                  </w:rPr>
+                  <m:t>(</m:t>
+                </m:r>
+                <m:r>
+                  <w:rPr>
+                    <w:rFonts w:ascii="Cambria Math" w:hAnsi="Cambria Math"/>
+                  </w:rPr>
+                  <m:t>ω)</m:t>
+                </m:r>
+              </m:oMath>
+            </m:oMathPara>
+          </w:p>
+        </w:tc>
+      </w:tr>
+      <w:tr>
+        <w:trPr>
+          <w:jc w:val="center"/>
+        </w:trPr>
+        <w:tc>
+          <w:tcPr>
+            <w:tcW w:w="988" w:type="dxa"/>
+          </w:tcPr>
+          <w:p>
+            <w:pPr>
+              <w:pStyle w:val="a3"/>
+              <w:ind w:firstLine="0"/>
+            </w:pPr>
+            <w:r>
+              <w:t>0</w:t>
+            </w:r>
+          </w:p>
+        </w:tc>
+        <w:tc>
+          <w:tcPr>
+            <w:tcW w:w="992" w:type="dxa"/>
+          </w:tcPr>
+          <w:p>
+            <w:pPr>
+              <w:pStyle w:val="a3"/>
+              <w:ind w:firstLine="0"/>
+              <w:rPr>
+                <w:lang w:val="en-US"/>
+              </w:rPr>
+            </w:pPr>
+            <w:r>
+              <w:rPr>
+                <w:lang w:val="en-US"/>
+              </w:rPr>
+              <w:t>1</w:t>
+            </w:r>
+          </w:p>
+        </w:tc>
+        <w:tc>
+          <w:tcPr>
+            <w:tcW w:w="992" w:type="dxa"/>
+          </w:tcPr>
+          <w:p>
+            <w:pPr>
+              <w:pStyle w:val="a3"/>
+              <w:ind w:firstLine="0"/>
+              <w:rPr>
+                <w:lang w:val="en-US"/>
+              </w:rPr>
+            </w:pPr>
+            <w:r>
+              <w:rPr>
+                <w:lang w:val="en-US"/>
+              </w:rPr>
+              <w:t>0</w:t>
+            </w:r>
+          </w:p>
+        </w:tc>
+        <w:tc>
+          <w:tcPr>
+            <w:tcW w:w="1985" w:type="dxa"/>
+          </w:tcPr>
+          <w:p>
+            <w:pPr>
+              <w:pStyle w:val="a3"/>
+              <w:ind w:firstLine="0"/>
+              <w:rPr>
+                <w:lang w:val="en-US"/>
+              </w:rPr>
+            </w:pPr>
+            <w:r>
+              <w:rPr>
+                <w:lang w:val="en-US"/>
+              </w:rPr>
+              <w:t>1</w:t>
+            </w:r>
+          </w:p>
+        </w:tc>
+        <w:tc>
+          <w:tcPr>
+            <w:tcW w:w="992" w:type="dxa"/>
+          </w:tcPr>
+          <w:p>
+            <w:pPr>
+              <w:pStyle w:val="a3"/>
+              <w:ind w:firstLine="0"/>
+              <w:rPr>
+                <w:lang w:val="en-US"/>
+              </w:rPr>
+            </w:pPr>
+            <w:r>
+              <w:rPr>
+                <w:lang w:val="en-US"/>
+              </w:rPr>
+              <w:t>1</w:t>
+            </w:r>
+          </w:p>
+        </w:tc>
+        <w:tc>
+          <w:tcPr>
+            <w:tcW w:w="1134" w:type="dxa"/>
+          </w:tcPr>
+          <w:p>
+            <w:pPr>
+              <w:pStyle w:val="a3"/>
+              <w:ind w:firstLine="0"/>
+              <w:rPr>
+                <w:lang w:val="en-US"/>
+              </w:rPr>
+            </w:pPr>
+            <w:r>
+              <w:rPr>
+                <w:lang w:val="en-US"/>
+              </w:rPr>
+              <w:t>0</w:t>
+            </w:r>
+          </w:p>
+        </w:tc>
+      </w:tr>
+      <w:tr>
+        <w:trPr>
+          <w:jc w:val="center"/>
+        </w:trPr>
+        <w:tc>
+          <w:tcPr>
+            <w:tcW w:w="988" w:type="dxa"/>
+          </w:tcPr>
+          <w:p>
+            <w:pPr>
+              <w:pStyle w:val="a3"/>
+              <w:ind w:firstLine="0"/>
+            </w:pPr>
+            <w:r>
+              <w:t>1</w:t>
+            </w:r>
+          </w:p>
+        </w:tc>
+        <w:tc>
+          <w:tcPr>
+            <w:tcW w:w="992" w:type="dxa"/>
+          </w:tcPr>
+          <w:p>
+            <w:pPr>
+              <w:pStyle w:val="a3"/>
+              <w:ind w:firstLine="0"/>
+              <w:rPr>
+                <w:lang w:val="en-US"/>
+              </w:rPr>
+            </w:pPr>
+            <w:r>
+              <w:rPr>
+                <w:lang w:val="en-US"/>
+              </w:rPr>
+              <w:t>0.05</w:t>
+            </w:r>
+          </w:p>
+        </w:tc>
+        <w:tc>
+          <w:tcPr>
+            <w:tcW w:w="992" w:type="dxa"/>
+          </w:tcPr>
+          <w:p>
+            <w:pPr>
+              <w:pStyle w:val="a3"/>
+              <w:ind w:firstLine="0"/>
+              <w:rPr>
+                <w:lang w:val="en-US"/>
+              </w:rPr>
+            </w:pPr>
+            <w:r>
+              <w:rPr>
+                <w:lang w:val="en-US"/>
+              </w:rPr>
+              <w:t>0.9</w:t>
+            </w:r>
+          </w:p>
+        </w:tc>
+        <w:tc>
+          <w:tcPr>
+            <w:tcW w:w="1985" w:type="dxa"/>
+          </w:tcPr>
+          <w:p>
+            <w:pPr>
+              <w:pStyle w:val="a3"/>
+              <w:ind w:firstLine="0"/>
+              <w:rPr>
+                <w:lang w:val="en-US"/>
+              </w:rPr>
+            </w:pPr>
+            <w:r>
+              <w:rPr>
+                <w:lang w:val="en-US"/>
+              </w:rPr>
+              <w:t>0.8125</w:t>
+            </w:r>
+          </w:p>
+        </w:tc>
+        <w:tc>
+          <w:tcPr>
+            <w:tcW w:w="992" w:type="dxa"/>
+          </w:tcPr>
+          <w:p>
+            <w:pPr>
+              <w:pStyle w:val="a3"/>
+              <w:ind w:firstLine="0"/>
+              <w:rPr>
+                <w:lang w:val="en-US"/>
+              </w:rPr>
+            </w:pPr>
+            <w:r>
+              <w:rPr>
+                <w:lang w:val="en-US"/>
+              </w:rPr>
+              <w:t>0.0615</w:t>
+            </w:r>
+          </w:p>
+        </w:tc>
+        <w:tc>
+          <w:tcPr>
+            <w:tcW w:w="1134" w:type="dxa"/>
+          </w:tcPr>
+          <w:p>
+            <w:pPr>
+              <w:pStyle w:val="a3"/>
+              <w:ind w:firstLine="0"/>
+              <w:rPr>
+                <w:lang w:val="en-US"/>
+              </w:rPr>
+            </w:pPr>
+            <w:r>
+              <w:rPr>
+                <w:lang w:val="en-US"/>
+              </w:rPr>
+              <w:t>-1.108</w:t>
+            </w:r>
+          </w:p>
+        </w:tc>
+      </w:tr>
+      <w:tr>
+        <w:trPr>
+          <w:jc w:val="center"/>
+        </w:trPr>
+        <w:tc>
+          <w:tcPr>
+            <w:tcW w:w="988" w:type="dxa"/>
+          </w:tcPr>
+          <w:p>
+            <w:pPr>
+              <w:pStyle w:val="a3"/>
+              <w:ind w:firstLine="0"/>
+            </w:pPr>
+            <w:r>
+              <w:t>2</w:t>
+            </w:r>
+          </w:p>
+        </w:tc>
+        <w:tc>
+          <w:tcPr>
+            <w:tcW w:w="992" w:type="dxa"/>
+          </w:tcPr>
+          <w:p>
+            <w:pPr>
+              <w:pStyle w:val="a3"/>
+              <w:ind w:firstLine="0"/>
+              <w:rPr>
+                <w:lang w:val="en-US"/>
+              </w:rPr>
+            </w:pPr>
+            <w:r>
+              <w:rPr>
+                <w:lang w:val="en-US"/>
+              </w:rPr>
+              <w:t>-2.2</w:t>
+            </w:r>
+          </w:p>
+        </w:tc>
+        <w:tc>
+          <w:tcPr>
+            <w:tcW w:w="992" w:type="dxa"/>
+          </w:tcPr>
+          <w:p>
+            <w:pPr>
+              <w:pStyle w:val="a3"/>
+              <w:ind w:firstLine="0"/>
+              <w:rPr>
+                <w:lang w:val="en-US"/>
+              </w:rPr>
+            </w:pPr>
+            <w:r>
+              <w:rPr>
+                <w:lang w:val="en-US"/>
+              </w:rPr>
+              <w:t>1.2</w:t>
+            </w:r>
+          </w:p>
+        </w:tc>
+        <w:tc>
+          <w:tcPr>
+            <w:tcW w:w="1985" w:type="dxa"/>
+          </w:tcPr>
+          <w:p>
+            <w:pPr>
+              <w:pStyle w:val="a3"/>
+              <w:ind w:firstLine="0"/>
+              <w:rPr>
+                <w:lang w:val="en-US"/>
+              </w:rPr>
+            </w:pPr>
+            <w:r>
+              <w:rPr>
+                <w:lang w:val="en-US"/>
+              </w:rPr>
+              <w:t>6.28</w:t>
+            </w:r>
+          </w:p>
+        </w:tc>
+        <w:tc>
+          <w:tcPr>
+            <w:tcW w:w="992" w:type="dxa"/>
+          </w:tcPr>
+          <w:p>
+            <w:pPr>
+              <w:pStyle w:val="a3"/>
+              <w:ind w:firstLine="0"/>
+              <w:rPr>
+                <w:lang w:val="en-US"/>
+              </w:rPr>
+            </w:pPr>
+            <w:r>
+              <w:rPr>
+                <w:lang w:val="en-US"/>
+              </w:rPr>
+              <w:t>-0.35</w:t>
+            </w:r>
+          </w:p>
+        </w:tc>
+        <w:tc>
+          <w:tcPr>
+            <w:tcW w:w="1134" w:type="dxa"/>
+          </w:tcPr>
+          <w:p>
+            <w:pPr>
+              <w:pStyle w:val="a3"/>
+              <w:ind w:firstLine="0"/>
+              <w:rPr>
+                <w:lang w:val="en-US"/>
+              </w:rPr>
+            </w:pPr>
+            <w:r>
+              <w:rPr>
+                <w:lang w:val="en-US"/>
+              </w:rPr>
+              <w:t>-0191</w:t>
+            </w:r>
+          </w:p>
+        </w:tc>
+      </w:tr>
+      <w:tr>
+        <w:trPr>
+          <w:jc w:val="center"/>
+        </w:trPr>
+        <w:tc>
+          <w:tcPr>
+            <w:tcW w:w="988" w:type="dxa"/>
+          </w:tcPr>
+          <w:p>
+            <w:pPr>
+              <w:pStyle w:val="a3"/>
+              <w:ind w:firstLine="0"/>
+            </w:pPr>
+            <w:r>
+              <w:t>3</w:t>
+            </w:r>
+          </w:p>
+        </w:tc>
+        <w:tc>
+          <w:tcPr>
+            <w:tcW w:w="992" w:type="dxa"/>
+          </w:tcPr>
+          <w:p>
+            <w:pPr>
+              <w:pStyle w:val="a3"/>
+              <w:ind w:firstLine="0"/>
+              <w:rPr>
+                <w:lang w:val="en-US"/>
+              </w:rPr>
+            </w:pPr>
+            <w:r>
+              <w:rPr>
+                <w:lang w:val="en-US"/>
+              </w:rPr>
+              <w:t>-5.95</w:t>
+            </w:r>
+          </w:p>
+        </w:tc>
+        <w:tc>
+          <w:tcPr>
+            <w:tcW w:w="992" w:type="dxa"/>
+          </w:tcPr>
+          <w:p>
+            <w:pPr>
+              <w:pStyle w:val="a3"/>
+              <w:ind w:firstLine="0"/>
+              <w:rPr>
+                <w:lang w:val="en-US"/>
+              </w:rPr>
+            </w:pPr>
+            <w:r>
+              <w:rPr>
+                <w:lang w:val="en-US"/>
+              </w:rPr>
+              <w:t>0.3</w:t>
+            </w:r>
+          </w:p>
+        </w:tc>
+        <w:tc>
+          <w:tcPr>
+            <w:tcW w:w="1985" w:type="dxa"/>
+          </w:tcPr>
+          <w:p>
+            <w:pPr>
+              <w:pStyle w:val="a3"/>
+              <w:ind w:firstLine="0"/>
+              <w:rPr>
+                <w:lang w:val="en-US"/>
+              </w:rPr>
+            </w:pPr>
+            <w:r>
+              <w:rPr>
+                <w:lang w:val="en-US"/>
+              </w:rPr>
+              <w:t>35.48</w:t>
+            </w:r>
+          </w:p>
+        </w:tc>
+        <w:tc>
+          <w:tcPr>
+            <w:tcW w:w="992" w:type="dxa"/>
+          </w:tcPr>
+          <w:p>
+            <w:pPr>
+              <w:pStyle w:val="a3"/>
+              <w:ind w:firstLine="0"/>
+              <w:rPr>
+                <w:lang w:val="en-US"/>
+              </w:rPr>
+            </w:pPr>
+            <w:r>
+              <w:rPr>
+                <w:lang w:val="en-US"/>
+              </w:rPr>
+              <w:t>-0.168</w:t>
+            </w:r>
+          </w:p>
+        </w:tc>
+        <w:tc>
+          <w:tcPr>
+            <w:tcW w:w="1134" w:type="dxa"/>
+          </w:tcPr>
+          <w:p>
+            <w:pPr>
+              <w:pStyle w:val="a3"/>
+              <w:ind w:firstLine="0"/>
+              <w:rPr>
+                <w:lang w:val="en-US"/>
+              </w:rPr>
+            </w:pPr>
+            <w:r>
+              <w:rPr>
+                <w:lang w:val="en-US"/>
+              </w:rPr>
+              <w:t>-0.0085</w:t>
+            </w:r>
+          </w:p>
+        </w:tc>
+      </w:tr>
+      <w:tr>
+        <w:trPr>
+          <w:jc w:val="center"/>
+        </w:trPr>
+        <w:tc>
+          <w:tcPr>
+            <w:tcW w:w="988" w:type="dxa"/>
+          </w:tcPr>
+          <w:p>
+            <w:pPr>
+              <w:pStyle w:val="a3"/>
+              <w:ind w:firstLine="0"/>
+              <w:rPr>
+                <w:rFonts w:cs="Times New Roman"/>
+                <w:szCs w:val="26"/>
+              </w:rPr>
+            </w:pPr>
+            <w:r>
+              <w:rPr>
+                <w:rStyle w:val="a9"/>
+                <w:rFonts w:cs="Times New Roman"/>
+                <w:color w:val="000000" w:themeColor="text1"/>
+                <w:szCs w:val="26"/>
+                <w:shd w:val="clear" w:color="auto" w:fill="FFFFFF"/>
+              </w:rPr>
+              <w:t>3,162</w:t>
+            </w:r>
+          </w:p>
+        </w:tc>
+        <w:tc>
+          <w:tcPr>
+            <w:tcW w:w="992" w:type="dxa"/>
+          </w:tcPr>
+          <w:p>
+            <w:pPr>
+              <w:pStyle w:val="a3"/>
+              <w:ind w:firstLine="0"/>
+            </w:pPr>
+          </w:p>
+        </w:tc>
+        <w:tc>
+          <w:tcPr>
+            <w:tcW w:w="992" w:type="dxa"/>
+          </w:tcPr>
+          <w:p>
+            <w:pPr>
+              <w:pStyle w:val="a3"/>
+              <w:ind w:firstLine="0"/>
+            </w:pPr>
+          </w:p>
+        </w:tc>
+        <w:tc>
+          <w:tcPr>
+            <w:tcW w:w="1985" w:type="dxa"/>
+          </w:tcPr>
+          <w:p>
+            <w:pPr>
+              <w:pStyle w:val="a3"/>
+              <w:ind w:firstLine="0"/>
+            </w:pPr>
+          </w:p>
+        </w:tc>
+        <w:tc>
+          <w:tcPr>
+            <w:tcW w:w="992" w:type="dxa"/>
+          </w:tcPr>
+          <w:p>
+            <w:pPr>
+              <w:pStyle w:val="a3"/>
+              <w:ind w:firstLine="0"/>
+            </w:pPr>
+          </w:p>
+        </w:tc>
+        <w:tc>
+          <w:tcPr>
+            <w:tcW w:w="1134" w:type="dxa"/>
+          </w:tcPr>
+          <w:p>
+            <w:pPr>
+              <w:pStyle w:val="a3"/>
+              <w:ind w:firstLine="0"/>
+            </w:pPr>
+          </w:p>
+        </w:tc>
+      </w:tr>
+      <w:tr>
+        <w:trPr>
+          <w:jc w:val="center"/>
+        </w:trPr>
+        <w:tc>
+          <w:tcPr>
+            <w:tcW w:w="988" w:type="dxa"/>
+          </w:tcPr>
+          <w:p>
+            <w:pPr>
+              <w:pStyle w:val="a3"/>
+              <w:ind w:firstLine="0"/>
+              <w:rPr>
+                <w:lang w:val="en-US"/>
+              </w:rPr>
+            </w:pPr>
+            <w:r>
+              <w:t>10</w:t>
+            </w:r>
+          </w:p>
+        </w:tc>
+        <w:tc>
+          <w:tcPr>
+            <w:tcW w:w="992" w:type="dxa"/>
+          </w:tcPr>
+          <w:p>
+            <w:pPr>
+              <w:pStyle w:val="a3"/>
+              <w:ind w:firstLine="0"/>
+            </w:pPr>
+          </w:p>
+        </w:tc>
+        <w:tc>
+          <w:tcPr>
+            <w:tcW w:w="992" w:type="dxa"/>
+          </w:tcPr>
+          <w:p>
+            <w:pPr>
+              <w:pStyle w:val="a3"/>
+              <w:ind w:firstLine="0"/>
+            </w:pPr>
+          </w:p>
+        </w:tc>
+        <w:tc>
+          <w:tcPr>
+            <w:tcW w:w="1985" w:type="dxa"/>
+          </w:tcPr>
+          <w:p>
+            <w:pPr>
+              <w:pStyle w:val="a3"/>
+              <w:ind w:firstLine="0"/>
+            </w:pPr>
+          </w:p>
+        </w:tc>
+        <w:tc>
+          <w:tcPr>
+            <w:tcW w:w="992" w:type="dxa"/>
+          </w:tcPr>
+          <w:p>
+            <w:pPr>
+              <w:pStyle w:val="a3"/>
+              <w:ind w:firstLine="0"/>
+            </w:pPr>
+          </w:p>
+        </w:tc>
+        <w:tc>
+          <w:tcPr>
+            <w:tcW w:w="1134" w:type="dxa"/>
+          </w:tcPr>
+          <w:p>
+            <w:pPr>
+              <w:pStyle w:val="a3"/>
+              <w:ind w:firstLine="0"/>
+            </w:pPr>
+          </w:p>
+        </w:tc>
+      </w:tr>
+      <w:tr>
+        <w:trPr>
+          <w:jc w:val="center"/>
+        </w:trPr>
+        <w:tc>
+          <w:tcPr>
+            <w:tcW w:w="988" w:type="dxa"/>
+          </w:tcPr>
+          <w:p>
+            <w:pPr>
+              <w:pStyle w:val="a3"/>
+              <w:ind w:firstLine="0"/>
+            </w:pPr>
+          </w:p>
+        </w:tc>
+        <w:tc>
+          <w:tcPr>
+            <w:tcW w:w="992" w:type="dxa"/>
+          </w:tcPr>
+          <w:p>
+            <w:pPr>
+              <w:pStyle w:val="a3"/>
+              <w:ind w:firstLine="0"/>
+            </w:pPr>
+          </w:p>
+        </w:tc>
+        <w:tc>
+          <w:tcPr>
+            <w:tcW w:w="992" w:type="dxa"/>
+          </w:tcPr>
+          <w:p>
+            <w:pPr>
+              <w:pStyle w:val="a3"/>
+              <w:ind w:firstLine="0"/>
+            </w:pPr>
+          </w:p>
+        </w:tc>
+        <w:tc>
+          <w:tcPr>
+            <w:tcW w:w="1985" w:type="dxa"/>
+          </w:tcPr>
+          <w:p>
+            <w:pPr>
+              <w:pStyle w:val="a3"/>
+              <w:ind w:firstLine="0"/>
+            </w:pPr>
+          </w:p>
+        </w:tc>
+        <w:tc>
+          <w:tcPr>
+            <w:tcW w:w="992" w:type="dxa"/>
+          </w:tcPr>
+          <w:p>
+            <w:pPr>
+              <w:pStyle w:val="a3"/>
+              <w:ind w:firstLine="0"/>
+            </w:pPr>
+          </w:p>
+        </w:tc>
+        <w:tc>
+          <w:tcPr>
+            <w:tcW w:w="1134" w:type="dxa"/>
+          </w:tcPr>
+          <w:p>
+            <w:pPr>
+              <w:pStyle w:val="a3"/>
+              <w:ind w:firstLine="0"/>
+            </w:pPr>
+          </w:p>
+        </w:tc>
+      </w:tr>
+    </w:tbl>
+    <w:p>
+      <w:pPr>
+        <w:pStyle w:val="a3"/>
+      </w:pPr>
+    </w:p>
+    <w:p>
+      <w:pPr>
+        <w:pStyle w:val="a3"/>
+      </w:pPr>
+    </w:p>
+    <w:p>
+      <w:pPr>
+        <w:pStyle w:val="a3"/>
+        <w:numPr>
+          <w:ilvl w:val="0"/>
+          <w:numId w:val="45"/>
+        </w:numPr>
+        <w:rPr>
+          <w:b/>
+          <w:bCs/>
+          <w:lang w:val="en-US"/>
+        </w:rPr>
+      </w:pPr>
+      <w:r>
+        <w:rPr>
+          <w:b/>
+          <w:bCs/>
+        </w:rPr>
+        <w:t xml:space="preserve">Проверка в </w:t>
+      </w:r>
+      <w:proofErr w:type="spellStart"/>
+      <w:r>
+        <w:rPr>
+          <w:b/>
+          <w:bCs/>
+          <w:lang w:val="en-US"/>
+        </w:rPr>
+        <w:t>Matlab</w:t>
+      </w:r>
+      <w:proofErr w:type="spellEnd"/>
+    </w:p>
+    <w:p>
+      <w:pPr>
+        <w:pStyle w:val="a3"/>
+      </w:pPr>
+      <w:r>
+        <w:t>Результат выпол</w:t>
+      </w:r>
+      <w:r>
+        <w:t>н</w:t>
+      </w:r>
+      <w:r>
+        <w:t>ения кода:</w:t>
+      </w:r>
+    </w:p>
+    <w:p>
+      <w:pPr>
+        <w:pStyle w:val="a3"/>
+      </w:pPr>
+      <w:r>
+        <w:t>Характеристический полином замкнутой системы:</w:t>
+      </w:r>
+    </w:p>
+    <w:p>
+      <w:pPr>
+        <w:pStyle w:val="a3"/>
+      </w:pPr>
+      <w:r>
+        <w:t xml:space="preserve">0.05 </w:t>
+      </w:r>
+      <w:r>
+        <w:rPr>
+          <w:lang w:val="en-US"/>
+        </w:rPr>
+        <w:t>s</w:t>
+      </w:r>
+      <w:r>
+        <w:t xml:space="preserve">^4 + 0.10 </w:t>
+      </w:r>
+      <w:r>
+        <w:rPr>
+          <w:lang w:val="en-US"/>
+        </w:rPr>
+        <w:t>s</w:t>
+      </w:r>
+      <w:r>
+        <w:t xml:space="preserve">^3 + 1.00 </w:t>
+      </w:r>
+      <w:r>
+        <w:rPr>
+          <w:lang w:val="en-US"/>
+        </w:rPr>
+        <w:t>s</w:t>
+      </w:r>
+      <w:r>
+        <w:t xml:space="preserve">^2 + 1.00 </w:t>
+      </w:r>
+      <w:r>
+        <w:rPr>
+          <w:lang w:val="en-US"/>
+        </w:rPr>
+        <w:t>s</w:t>
+      </w:r>
+      <w:r>
+        <w:t xml:space="preserve"> + 2.00</w:t>
+      </w:r>
+    </w:p>
+    <w:p>
+      <w:pPr>
+        <w:pStyle w:val="a3"/>
+      </w:pPr>
+    </w:p>
+    <w:p>
+      <w:pPr>
+        <w:pStyle w:val="a3"/>
+      </w:pPr>
+      <w:r>
+        <w:t xml:space="preserve">Матрица Гурвица </w:t>
+      </w:r>
+      <w:r>
+        <w:rPr>
+          <w:lang w:val="en-US"/>
+        </w:rPr>
+        <w:t>H</w:t>
+      </w:r>
+      <w:r>
+        <w:t xml:space="preserve"> (4</w:t>
+      </w:r>
+      <w:r>
+        <w:rPr>
+          <w:lang w:val="en-US"/>
+        </w:rPr>
+        <w:t>x</w:t>
+      </w:r>
+      <w:r>
+        <w:t>4):</w:t>
+      </w:r>
+    </w:p>
+    <w:p>
+      <w:pPr>
+        <w:pStyle w:val="a3"/>
+      </w:pPr>
+      <w:r>
+        <w:t xml:space="preserve">    0.1000    0.0500         0         0</w:t>
+      </w:r>
+    </w:p>
+    <w:p>
+      <w:pPr>
+        <w:pStyle w:val="a3"/>
+      </w:pPr>
+      <w:r>
+        <w:t xml:space="preserve">    1.0000    1.0000    0.1000    0.0500</w:t>
+      </w:r>
+    </w:p>
+    <w:p>
+      <w:pPr>
+        <w:pStyle w:val="a3"/>
+      </w:pPr>
+      <w:r>
+        <w:t xml:space="preserve">         0    2.0000    1.0000    1.0000</w:t>
+      </w:r>
+    </w:p>
+    <w:p>
+      <w:pPr>
+        <w:pStyle w:val="a3"/>
+      </w:pPr>
+      <w:r>
+        <w:t xml:space="preserve">         0         0         0    2.0000</w:t>
+      </w:r>
+    </w:p>
+    <w:p>
+      <w:pPr>
+        <w:pStyle w:val="a3"/>
+      </w:pPr>
+    </w:p>
+    <w:p>
+      <w:pPr>
+        <w:pStyle w:val="a3"/>
+      </w:pPr>
+      <w:r>
+        <w:rPr>
+          <w:lang w:val="en-US"/>
+        </w:rPr>
+        <w:t>Δ</w:t>
+      </w:r>
+      <w:r>
+        <w:t>1 = 0.1000</w:t>
+      </w:r>
+    </w:p>
+    <w:p>
+      <w:pPr>
+        <w:pStyle w:val="a3"/>
+      </w:pPr>
+      <w:r>
+        <w:rPr>
+          <w:lang w:val="en-US"/>
+        </w:rPr>
+        <w:t>Δ</w:t>
+      </w:r>
+      <w:r>
+        <w:t>2 = 0.0500</w:t>
+      </w:r>
+    </w:p>
+    <w:p>
+      <w:pPr>
+        <w:pStyle w:val="a3"/>
+      </w:pPr>
+      <w:r>
+        <w:rPr>
+          <w:lang w:val="en-US"/>
+        </w:rPr>
+        <w:t>Δ</w:t>
+      </w:r>
+      <w:r>
+        <w:t>3 = 0.0300</w:t>
+      </w:r>
+    </w:p>
+    <w:p>
+      <w:pPr>
+        <w:pStyle w:val="a3"/>
+      </w:pPr>
+      <w:r>
+        <w:rPr>
+          <w:lang w:val="en-US"/>
+        </w:rPr>
+        <w:t>Δ</w:t>
+      </w:r>
+      <w:r>
+        <w:t>4 = 0.0600</w:t>
+      </w:r>
+    </w:p>
+    <w:p>
+      <w:pPr>
+        <w:pStyle w:val="a3"/>
+      </w:pPr>
+    </w:p>
+    <w:p>
+      <w:pPr>
+        <w:pStyle w:val="a3"/>
+      </w:pPr>
+      <w:r>
+        <w:t xml:space="preserve">Необходимое условие выполняется: все </w:t>
+      </w:r>
+      <w:proofErr w:type="gramStart"/>
+      <w:r>
+        <w:t>коэффициенты &gt;</w:t>
+      </w:r>
+      <w:proofErr w:type="gramEnd"/>
+      <w:r>
+        <w:t xml:space="preserve"> 0</w:t>
+      </w:r>
+    </w:p>
+    <w:p>
+      <w:pPr>
+        <w:pStyle w:val="a3"/>
+      </w:pPr>
+      <w:r>
+        <w:t>Все миноры Гурвица положительны.</w:t>
+      </w:r>
+    </w:p>
+    <w:p>
+      <w:pPr>
+        <w:pStyle w:val="a3"/>
+        <w:rPr>
+          <w:lang w:val="en-US"/>
+        </w:rPr>
+      </w:pPr>
+      <w:r>
+        <w:t xml:space="preserve">ВЫВОД: Замкнутая система УСТОЙЧИВА по критерию </w:t>
+      </w:r>
+      <w:proofErr w:type="spellStart"/>
+      <w:r>
+        <w:rPr>
+          <w:lang w:val="en-US"/>
+        </w:rPr>
+        <w:t>Гурвица</w:t>
+      </w:r>
+      <w:proofErr w:type="spellEnd"/>
+      <w:r>
+        <w:rPr>
+          <w:lang w:val="en-US"/>
+        </w:rPr>
+        <w:t>.</w:t>
+      </w:r>
+    </w:p>
+    <w:p>
+      <w:pPr>
+        <w:pStyle w:val="a3"/>
+        <w:rPr>
+          <w:lang w:val="en-US"/>
+        </w:rPr>
+      </w:pPr>
+      <w:r>
+        <w:rPr>
+          <w:lang w:val="en-US"/>
+        </w:rPr>
+        <w:t>&gt;&gt;</w:t>
+      </w:r>
+    </w:p>
+    <w:p>
+      <w:pPr>
+        <w:pStyle w:val="a3"/>
+        <w:rPr>
+          <w:lang w:val="en-US"/>
+        </w:rPr>
+      </w:pPr>
+    </w:p>
+    <w:p>
+      <w:pPr>
+        <w:pStyle w:val="a3"/>
+        <w:rPr>
+          <w:lang w:val="en-US"/>
+        </w:rPr>
+      </w:pPr>
+    </w:p>
+    <w:p>
+      <w:pPr>
+        <w:pStyle w:val="a3"/>
+        <w:rPr>
+          <w:lang w:val="en-US"/>
+        </w:rPr>
+      </w:pPr>
+    </w:p>
+    <w:p>
+      <w:pPr>
+        <w:pStyle w:val="a3"/>
+        <w:rPr>
+          <w:lang w:val="en-US"/>
+        </w:rPr>
+      </w:pPr>
+    </w:p>
+    <w:p>
+      <w:pPr>
+        <w:pStyle w:val="a3"/>
+        <w:rPr>
+          <w:lang w:val="en-US"/>
+        </w:rPr>
+      </w:pPr>
+    </w:p>
+    <w:p>
+      <w:pPr>
+        <w:pStyle w:val="a3"/>
+        <w:rPr>
+          <w:lang w:val="en-US"/>
+        </w:rPr>
+      </w:pPr>
+    </w:p>
+    <w:p>
+      <w:pPr>
+        <w:pStyle w:val="a3"/>
+        <w:rPr>
+          <w:lang w:val="en-US"/>
+        </w:rPr>
+      </w:pPr>
+    </w:p>
+    <w:p>
+      <w:pPr>
+        <w:pStyle w:val="a3"/>
+        <w:rPr>
+          <w:rFonts w:ascii="SchoolBookC" w:cs="SchoolBookC"/>
+        </w:rPr>
+      </w:pPr>
+      <w:r>
+        <w:lastRenderedPageBreak/>
+        <w:t>Для</w:t>
+      </w:r>
+      <w:r>
+        <w:rPr>
+          <w:rFonts w:ascii="SchoolBookC" w:cs="SchoolBookC"/>
+        </w:rPr>
+        <w:t xml:space="preserve"> </w:t>
+      </w:r>
+      <w:r>
+        <w:t>проверки</w:t>
+      </w:r>
+      <w:r>
+        <w:rPr>
+          <w:rFonts w:ascii="SchoolBookC" w:cs="SchoolBookC"/>
+        </w:rPr>
+        <w:t xml:space="preserve"> </w:t>
+      </w:r>
+      <w:r>
+        <w:t>устойчивости</w:t>
+      </w:r>
+      <w:r>
+        <w:rPr>
+          <w:rFonts w:ascii="SchoolBookC" w:cs="SchoolBookC"/>
+        </w:rPr>
+        <w:t xml:space="preserve"> </w:t>
+      </w:r>
+      <w:r>
+        <w:t>САУ</w:t>
+      </w:r>
+      <w:r>
+        <w:rPr>
+          <w:rFonts w:ascii="SchoolBookC" w:cs="SchoolBookC"/>
+        </w:rPr>
+        <w:t xml:space="preserve"> </w:t>
+      </w:r>
+      <w:r>
+        <w:t>по</w:t>
+      </w:r>
+      <w:r>
+        <w:rPr>
+          <w:rFonts w:ascii="SchoolBookC" w:cs="SchoolBookC"/>
+        </w:rPr>
+        <w:t xml:space="preserve"> </w:t>
+      </w:r>
+      <w:r>
+        <w:t>Найквисту</w:t>
+      </w:r>
+      <w:r>
+        <w:rPr>
+          <w:rFonts w:ascii="SchoolBookC" w:cs="SchoolBookC"/>
+        </w:rPr>
+        <w:t xml:space="preserve"> </w:t>
+      </w:r>
+      <w:r>
+        <w:t>сначала</w:t>
+      </w:r>
+      <w:r>
+        <w:rPr>
+          <w:rFonts w:ascii="SchoolBookC" w:cs="SchoolBookC"/>
+        </w:rPr>
+        <w:t xml:space="preserve"> </w:t>
+      </w:r>
+      <w:r>
+        <w:t>нужно</w:t>
+      </w:r>
+    </w:p>
+    <w:p>
+      <w:pPr>
+        <w:pStyle w:val="a3"/>
+        <w:rPr>
+          <w:rFonts w:asciiTheme="minorHAnsi" w:hAnsiTheme="minorHAnsi" w:cs="SchoolBookC"/>
+        </w:rPr>
+      </w:pPr>
+      <w:r>
+        <w:t>выяснить</w:t>
+      </w:r>
+      <w:r>
+        <w:rPr>
+          <w:rFonts w:ascii="SchoolBookC" w:cs="SchoolBookC"/>
+        </w:rPr>
+        <w:t xml:space="preserve">, </w:t>
+      </w:r>
+      <w:r>
+        <w:t>является</w:t>
+      </w:r>
+      <w:r>
+        <w:rPr>
+          <w:rFonts w:ascii="SchoolBookC" w:cs="SchoolBookC"/>
+        </w:rPr>
+        <w:t xml:space="preserve"> </w:t>
+      </w:r>
+      <w:r>
+        <w:t>ли</w:t>
+      </w:r>
+      <w:r>
+        <w:rPr>
+          <w:rFonts w:ascii="SchoolBookC" w:cs="SchoolBookC"/>
+        </w:rPr>
+        <w:t xml:space="preserve"> </w:t>
+      </w:r>
+      <w:r>
+        <w:t>устойчивой</w:t>
+      </w:r>
+      <w:r>
+        <w:rPr>
+          <w:rFonts w:ascii="SchoolBookC" w:cs="SchoolBookC"/>
+        </w:rPr>
+        <w:t xml:space="preserve"> </w:t>
+      </w:r>
+      <w:r>
+        <w:t>разомкнутая</w:t>
+      </w:r>
+      <w:r>
+        <w:rPr>
+          <w:rFonts w:ascii="SchoolBookC" w:cs="SchoolBookC"/>
+        </w:rPr>
+        <w:t xml:space="preserve"> </w:t>
+      </w:r>
+      <w:r>
+        <w:t>система</w:t>
+      </w:r>
+      <w:r>
+        <w:rPr>
+          <w:rFonts w:ascii="SchoolBookC" w:cs="SchoolBookC"/>
+        </w:rPr>
+        <w:t>.</w:t>
+      </w:r>
+    </w:p>
+    <w:p>
+      <w:pPr>
+        <w:pStyle w:val="a3"/>
+        <w:jc w:val="center"/>
+        <w:rPr>
+          <w:rFonts w:asciiTheme="minorHAnsi" w:hAnsiTheme="minorHAnsi"/>
+          <w:lang w:val="en-US"/>
+        </w:rPr>
+      </w:pPr>
+      <w:r>
+        <w:rPr>
+          <w:noProof/>
+        </w:rPr>
+        <w:drawing>
+          <wp:inline distT="0" distB="0" distL="0" distR="0" wp14:anchorId="3287760A" wp14:editId="617B44ED">
+            <wp:extent cx="3416198" cy="2726193"/>
+            <wp:effectExtent l="0" t="0" r="0" b="0"/>
+            <wp:docPr id="1" name="Рисунок 1"/>
+            <wp:cNvGraphicFramePr>
+              <a:graphicFrameLocks xmlns:a="http://schemas.openxmlformats.org/drawingml/2006/main" noChangeAspect="1"/>
+            </wp:cNvGraphicFramePr>
+            <a:graphic xmlns:a="http://schemas.openxmlformats.org/drawingml/2006/main">
+              <a:graphicData uri="http://schemas.openxmlformats.org/drawingml/2006/picture">
+                <pic:pic xmlns:pic="http://schemas.openxmlformats.org/drawingml/2006/picture">
+                  <pic:nvPicPr>
+                    <pic:cNvPr id="1" name=""/>
+                    <pic:cNvPicPr/>
+                  </pic:nvPicPr>
+                  <pic:blipFill>
+                    <a:blip r:embed="rId7"/>
+                    <a:stretch>
+                      <a:fillRect/>
+                    </a:stretch>
+                  </pic:blipFill>
+                  <pic:spPr>
+                    <a:xfrm>
+                      <a:off x="0" y="0"/>
+                      <a:ext cx="3423935" cy="2732367"/>
+                    </a:xfrm>
+                    <a:prstGeom prst="rect">
+                      <a:avLst/>
+                    </a:prstGeom>
+                  </pic:spPr>
+                </pic:pic>
+              </a:graphicData>
+            </a:graphic>
+          </wp:inline>
+        </w:drawing>
+      </w:r>
+    </w:p>
     <w:sectPr>
-      <w:footerReference w:type="default" r:id="rId7"/>
+      <w:footerReference w:type="default" r:id="rId8"/>
       <w:pgSz w:w="11906" w:h="16838"/>
       <w:pgMar w:top="1134" w:right="1134" w:bottom="1134" w:left="1701" w:header="709" w:footer="709" w:gutter="0"/>
       <w:cols w:space="708"/>
@@ -5971,7 +7580,7 @@
   <w:abstractNum w:abstractNumId="11" w15:restartNumberingAfterBreak="0">
     <w:nsid w:val="291B3B53"/>
     <w:multiLevelType w:val="hybridMultilevel"/>
-    <w:tmpl w:val="7E9A382E"/>
+    <w:tmpl w:val="20BC1B46"/>
     <w:lvl w:ilvl="0" w:tplc="0419000F">
       <w:start w:val="1"/>
       <w:numFmt w:val="decimal"/>
@@ -10293,7 +11902,6 @@
   <w:style w:type="character" w:default="1" w:styleId="a0">
     <w:name w:val="Default Paragraph Font"/>
     <w:uiPriority w:val="1"/>
-    <w:semiHidden/>
     <w:unhideWhenUsed/>
   </w:style>
   <w:style w:type="table" w:default="1" w:styleId="a1">

</xml_diff>

<commit_message>
fix: make slight edits
</commit_message>
<xml_diff>
--- a/08-semester/Автоматика/Лабы. Решения/Лабораторная 3.docx
+++ b/08-semester/Автоматика/Лабы. Решения/Лабораторная 3.docx
@@ -5884,6 +5884,7 @@
       <w:r>
         <w:rPr>
           <w:rFonts w:ascii="Consolas" w:eastAsia="Times New Roman" w:hAnsi="Consolas" w:cs="Times New Roman"/>
+          <w:noProof/>
           <w:sz w:val="20"/>
           <w:szCs w:val="20"/>
           <w:lang w:eastAsia="ru-RU"/>
@@ -6051,7 +6052,10 @@
         <w:pStyle w:val="a3"/>
       </w:pPr>
       <w:r>
-        <w:t>Заключение. Замкнутая система автоматического управления удовлетворяет условиям устойчивости как по алгебраическому критерию Гурвица, так и по частотному критерию Найквиста. Результаты теоретического анализа и численного эксперимента в MatLab полностью совпадают. Система работоспособна</w:t>
+        <w:t>Заключение. Замкнутая система автоматического управления удовлетворяет условиям устойчивости как по алгебраическому критерию Гурвица, так и по частотному критерию Найквиста. Результаты теоретического анализа и численного эксперимента в MatLab полностью совпадают</w:t>
+      </w:r>
+      <w:r>
+        <w:t>.</w:t>
       </w:r>
     </w:p>
     <w:sectPr>

</xml_diff>